<commit_message>
feat: token encryption (Fernet), JWT auth, swap Celery→django-q2 (D1-06/D1-11/D-10)
</commit_message>
<xml_diff>
--- a/Developer_Task_Breakdown.docx
+++ b/Developer_Task_Breakdown.docx
@@ -37,7 +37,7 @@
         </w:rPr>
         <w:t>WhatsApp + Instagram  ·  Multi-tenant  ·  Rule-based</w:t>
         <w:br/>
-        <w:t>Version 1.0  ·  Generated 2026-06-03  ·  Stack: Django + DRF</w:t>
+        <w:t>Version 1.0  ·  Generated 2026-06-08  ·  Stack: Django + DRF</w:t>
         <w:br/>
         <w:t>Team: 3 developers (2 Senior + 1 Junior) + AI juniors</w:t>
       </w:r>
@@ -12189,6 +12189,3668 @@
       </w:pPr>
       <w:r>
         <w:t>☐  A non-engineer can onboard a client by following the runbook.</w:t>
+      </w:r>
+    </w:p>
+    <w:p/>
+    <w:p>
+      <w:r>
+        <w:br w:type="page"/>
+      </w:r>
+    </w:p>
+    <w:p>
+      <w:pPr>
+        <w:pStyle w:val="Heading1"/>
+      </w:pPr>
+      <w:r>
+        <w:rPr>
+          <w:color w:val="1F3A5F"/>
+        </w:rPr>
+        <w:t>Frontend — React SPA (“Relay”)</w:t>
+      </w:r>
+    </w:p>
+    <w:p>
+      <w:r>
+        <w:rPr>
+          <w:b/>
+        </w:rPr>
+        <w:t xml:space="preserve">Scope. </w:t>
+      </w:r>
+      <w:r>
+        <w:t>The custom admin panel (D-107): React SPA against the Django/DRF API, JWT auth. Owner: Dev 3 (React) + Dev 1 (flow-builder logic). Each screen is gated on its DRF endpoint existing. The live phone preview is Phase 2. NOTE: the former 'Dev 3 admin CRUD' tickets become DRF API endpoints feeding these screens.</w:t>
+      </w:r>
+    </w:p>
+    <w:p>
+      <w:r>
+        <w:t>18 tasks across 6 epics.</w:t>
+      </w:r>
+    </w:p>
+    <w:p>
+      <w:pPr>
+        <w:pStyle w:val="Heading2"/>
+      </w:pPr>
+      <w:r>
+        <w:rPr>
+          <w:color w:val="555555"/>
+        </w:rPr>
+        <w:t>Epic FE-A — Scaffold &amp; foundation</w:t>
+      </w:r>
+    </w:p>
+    <w:p>
+      <w:pPr>
+        <w:pStyle w:val="Heading3"/>
+      </w:pPr>
+      <w:r>
+        <w:rPr>
+          <w:color w:val="1F3A5F"/>
+        </w:rPr>
+        <w:t>F-01 · React app scaffold</w:t>
+      </w:r>
+    </w:p>
+    <w:tbl>
+      <w:tblPr>
+        <w:tblStyle w:val="TableGrid"/>
+        <w:tblW w:type="auto" w:w="0"/>
+        <w:jc w:val="left"/>
+        <w:tblLook w:firstColumn="1" w:firstRow="1" w:lastColumn="0" w:lastRow="0" w:noHBand="0" w:noVBand="1" w:val="04A0"/>
+      </w:tblPr>
+      <w:tblGrid>
+        <w:gridCol w:w="4320"/>
+        <w:gridCol w:w="4320"/>
+      </w:tblGrid>
+      <w:tr>
+        <w:tc>
+          <w:tcPr>
+            <w:tcW w:type="dxa" w:w="2016"/>
+            <w:shd w:val="clear" w:fill="EAEEF3"/>
+          </w:tcPr>
+          <w:p>
+            <w:r>
+              <w:rPr>
+                <w:b/>
+              </w:rPr>
+              <w:t>Tag</w:t>
+            </w:r>
+          </w:p>
+        </w:tc>
+        <w:tc>
+          <w:tcPr>
+            <w:tcW w:type="dxa" w:w="6912"/>
+          </w:tcPr>
+          <w:p>
+            <w:r>
+              <w:t>[S] Shared</w:t>
+            </w:r>
+          </w:p>
+        </w:tc>
+      </w:tr>
+      <w:tr>
+        <w:tc>
+          <w:tcPr>
+            <w:tcW w:type="dxa" w:w="2016"/>
+            <w:shd w:val="clear" w:fill="EAEEF3"/>
+          </w:tcPr>
+          <w:p>
+            <w:r>
+              <w:rPr>
+                <w:b/>
+              </w:rPr>
+              <w:t>Size</w:t>
+            </w:r>
+          </w:p>
+        </w:tc>
+        <w:tc>
+          <w:tcPr>
+            <w:tcW w:type="dxa" w:w="6912"/>
+          </w:tcPr>
+          <w:p>
+            <w:r>
+              <w:t>M (~1 day)</w:t>
+            </w:r>
+          </w:p>
+        </w:tc>
+      </w:tr>
+      <w:tr>
+        <w:tc>
+          <w:tcPr>
+            <w:tcW w:type="dxa" w:w="2016"/>
+            <w:shd w:val="clear" w:fill="EAEEF3"/>
+          </w:tcPr>
+          <w:p>
+            <w:r>
+              <w:rPr>
+                <w:b/>
+              </w:rPr>
+              <w:t>Depends on</w:t>
+            </w:r>
+          </w:p>
+        </w:tc>
+        <w:tc>
+          <w:tcPr>
+            <w:tcW w:type="dxa" w:w="6912"/>
+          </w:tcPr>
+          <w:p>
+            <w:r>
+              <w:t>—</w:t>
+            </w:r>
+          </w:p>
+        </w:tc>
+      </w:tr>
+      <w:tr>
+        <w:tc>
+          <w:tcPr>
+            <w:tcW w:type="dxa" w:w="2016"/>
+            <w:shd w:val="clear" w:fill="EAEEF3"/>
+          </w:tcPr>
+          <w:p>
+            <w:r>
+              <w:rPr>
+                <w:b/>
+              </w:rPr>
+              <w:t>AI-junior?</w:t>
+            </w:r>
+          </w:p>
+        </w:tc>
+        <w:tc>
+          <w:tcPr>
+            <w:tcW w:type="dxa" w:w="6912"/>
+          </w:tcPr>
+          <w:p>
+            <w:r>
+              <w:t>Yes</w:t>
+            </w:r>
+          </w:p>
+        </w:tc>
+      </w:tr>
+      <w:tr>
+        <w:tc>
+          <w:tcPr>
+            <w:tcW w:type="dxa" w:w="2016"/>
+            <w:shd w:val="clear" w:fill="EAEEF3"/>
+          </w:tcPr>
+          <w:p>
+            <w:r>
+              <w:rPr>
+                <w:b/>
+              </w:rPr>
+              <w:t>Spec refs</w:t>
+            </w:r>
+          </w:p>
+        </w:tc>
+        <w:tc>
+          <w:tcPr>
+            <w:tcW w:type="dxa" w:w="6912"/>
+          </w:tcPr>
+          <w:p>
+            <w:r>
+              <w:t>frontend_spec.md §2</w:t>
+            </w:r>
+          </w:p>
+        </w:tc>
+      </w:tr>
+    </w:tbl>
+    <w:p/>
+    <w:p>
+      <w:r>
+        <w:rPr>
+          <w:b/>
+        </w:rPr>
+        <w:t xml:space="preserve">Description. </w:t>
+      </w:r>
+      <w:r>
+        <w:t>Stand up the SPA with routing and the Relay design tokens.</w:t>
+      </w:r>
+    </w:p>
+    <w:p>
+      <w:pPr>
+        <w:pStyle w:val="IntenseQuote"/>
+      </w:pPr>
+      <w:r>
+        <w:t>Technical notes</w:t>
+      </w:r>
+    </w:p>
+    <w:p>
+      <w:pPr>
+        <w:pStyle w:val="ListBullet"/>
+      </w:pPr>
+      <w:r>
+        <w:t>Vite + React + TypeScript; routing; tokens as CSS vars; brand fonts.</w:t>
+      </w:r>
+    </w:p>
+    <w:p>
+      <w:pPr>
+        <w:pStyle w:val="IntenseQuote"/>
+      </w:pPr>
+      <w:r>
+        <w:t>Acceptance criteria</w:t>
+      </w:r>
+    </w:p>
+    <w:p>
+      <w:pPr>
+        <w:pStyle w:val="ListBullet"/>
+      </w:pPr>
+      <w:r>
+        <w:t>☐  App builds and serves; tokens + fonts applied.</w:t>
+      </w:r>
+    </w:p>
+    <w:p/>
+    <w:p>
+      <w:pPr>
+        <w:pStyle w:val="Heading3"/>
+      </w:pPr>
+      <w:r>
+        <w:rPr>
+          <w:color w:val="1F3A5F"/>
+        </w:rPr>
+        <w:t>F-02 · API client + auth handling</w:t>
+      </w:r>
+    </w:p>
+    <w:tbl>
+      <w:tblPr>
+        <w:tblStyle w:val="TableGrid"/>
+        <w:tblW w:type="auto" w:w="0"/>
+        <w:jc w:val="left"/>
+        <w:tblLook w:firstColumn="1" w:firstRow="1" w:lastColumn="0" w:lastRow="0" w:noHBand="0" w:noVBand="1" w:val="04A0"/>
+      </w:tblPr>
+      <w:tblGrid>
+        <w:gridCol w:w="4320"/>
+        <w:gridCol w:w="4320"/>
+      </w:tblGrid>
+      <w:tr>
+        <w:tc>
+          <w:tcPr>
+            <w:tcW w:type="dxa" w:w="2016"/>
+            <w:shd w:val="clear" w:fill="EAEEF3"/>
+          </w:tcPr>
+          <w:p>
+            <w:r>
+              <w:rPr>
+                <w:b/>
+              </w:rPr>
+              <w:t>Tag</w:t>
+            </w:r>
+          </w:p>
+        </w:tc>
+        <w:tc>
+          <w:tcPr>
+            <w:tcW w:type="dxa" w:w="6912"/>
+          </w:tcPr>
+          <w:p>
+            <w:r>
+              <w:t>[S] Shared</w:t>
+            </w:r>
+          </w:p>
+        </w:tc>
+      </w:tr>
+      <w:tr>
+        <w:tc>
+          <w:tcPr>
+            <w:tcW w:type="dxa" w:w="2016"/>
+            <w:shd w:val="clear" w:fill="EAEEF3"/>
+          </w:tcPr>
+          <w:p>
+            <w:r>
+              <w:rPr>
+                <w:b/>
+              </w:rPr>
+              <w:t>Size</w:t>
+            </w:r>
+          </w:p>
+        </w:tc>
+        <w:tc>
+          <w:tcPr>
+            <w:tcW w:type="dxa" w:w="6912"/>
+          </w:tcPr>
+          <w:p>
+            <w:r>
+              <w:t>M (~1 day)</w:t>
+            </w:r>
+          </w:p>
+        </w:tc>
+      </w:tr>
+      <w:tr>
+        <w:tc>
+          <w:tcPr>
+            <w:tcW w:type="dxa" w:w="2016"/>
+            <w:shd w:val="clear" w:fill="EAEEF3"/>
+          </w:tcPr>
+          <w:p>
+            <w:r>
+              <w:rPr>
+                <w:b/>
+              </w:rPr>
+              <w:t>Depends on</w:t>
+            </w:r>
+          </w:p>
+        </w:tc>
+        <w:tc>
+          <w:tcPr>
+            <w:tcW w:type="dxa" w:w="6912"/>
+          </w:tcPr>
+          <w:p>
+            <w:r>
+              <w:t>F-01</w:t>
+            </w:r>
+          </w:p>
+        </w:tc>
+      </w:tr>
+      <w:tr>
+        <w:tc>
+          <w:tcPr>
+            <w:tcW w:type="dxa" w:w="2016"/>
+            <w:shd w:val="clear" w:fill="EAEEF3"/>
+          </w:tcPr>
+          <w:p>
+            <w:r>
+              <w:rPr>
+                <w:b/>
+              </w:rPr>
+              <w:t>AI-junior?</w:t>
+            </w:r>
+          </w:p>
+        </w:tc>
+        <w:tc>
+          <w:tcPr>
+            <w:tcW w:type="dxa" w:w="6912"/>
+          </w:tcPr>
+          <w:p>
+            <w:r>
+              <w:t>Partial</w:t>
+            </w:r>
+          </w:p>
+        </w:tc>
+      </w:tr>
+      <w:tr>
+        <w:tc>
+          <w:tcPr>
+            <w:tcW w:type="dxa" w:w="2016"/>
+            <w:shd w:val="clear" w:fill="EAEEF3"/>
+          </w:tcPr>
+          <w:p>
+            <w:r>
+              <w:rPr>
+                <w:b/>
+              </w:rPr>
+              <w:t>Spec refs</w:t>
+            </w:r>
+          </w:p>
+        </w:tc>
+        <w:tc>
+          <w:tcPr>
+            <w:tcW w:type="dxa" w:w="6912"/>
+          </w:tcPr>
+          <w:p>
+            <w:r>
+              <w:t>architecture.md §6.1</w:t>
+            </w:r>
+          </w:p>
+        </w:tc>
+      </w:tr>
+    </w:tbl>
+    <w:p/>
+    <w:p>
+      <w:r>
+        <w:rPr>
+          <w:b/>
+        </w:rPr>
+        <w:t xml:space="preserve">Description. </w:t>
+      </w:r>
+      <w:r>
+        <w:t>Central API wrapper with JWT and 401 handling.</w:t>
+      </w:r>
+    </w:p>
+    <w:p>
+      <w:pPr>
+        <w:pStyle w:val="IntenseQuote"/>
+      </w:pPr>
+      <w:r>
+        <w:t>Technical notes</w:t>
+      </w:r>
+    </w:p>
+    <w:p>
+      <w:pPr>
+        <w:pStyle w:val="ListBullet"/>
+      </w:pPr>
+      <w:r>
+        <w:t>Bearer token on every call; store/clear token; 401 → login; base URL from env.</w:t>
+      </w:r>
+    </w:p>
+    <w:p>
+      <w:pPr>
+        <w:pStyle w:val="IntenseQuote"/>
+      </w:pPr>
+      <w:r>
+        <w:t>Acceptance criteria</w:t>
+      </w:r>
+    </w:p>
+    <w:p>
+      <w:pPr>
+        <w:pStyle w:val="ListBullet"/>
+      </w:pPr>
+      <w:r>
+        <w:t>☐  Authed calls succeed; 401 redirects to login.</w:t>
+      </w:r>
+    </w:p>
+    <w:p/>
+    <w:p>
+      <w:pPr>
+        <w:pStyle w:val="Heading3"/>
+      </w:pPr>
+      <w:r>
+        <w:rPr>
+          <w:color w:val="1F3A5F"/>
+        </w:rPr>
+        <w:t>F-03 · App shell</w:t>
+      </w:r>
+    </w:p>
+    <w:tbl>
+      <w:tblPr>
+        <w:tblStyle w:val="TableGrid"/>
+        <w:tblW w:type="auto" w:w="0"/>
+        <w:jc w:val="left"/>
+        <w:tblLook w:firstColumn="1" w:firstRow="1" w:lastColumn="0" w:lastRow="0" w:noHBand="0" w:noVBand="1" w:val="04A0"/>
+      </w:tblPr>
+      <w:tblGrid>
+        <w:gridCol w:w="4320"/>
+        <w:gridCol w:w="4320"/>
+      </w:tblGrid>
+      <w:tr>
+        <w:tc>
+          <w:tcPr>
+            <w:tcW w:type="dxa" w:w="2016"/>
+            <w:shd w:val="clear" w:fill="EAEEF3"/>
+          </w:tcPr>
+          <w:p>
+            <w:r>
+              <w:rPr>
+                <w:b/>
+              </w:rPr>
+              <w:t>Tag</w:t>
+            </w:r>
+          </w:p>
+        </w:tc>
+        <w:tc>
+          <w:tcPr>
+            <w:tcW w:type="dxa" w:w="6912"/>
+          </w:tcPr>
+          <w:p>
+            <w:r>
+              <w:t>[S] Shared</w:t>
+            </w:r>
+          </w:p>
+        </w:tc>
+      </w:tr>
+      <w:tr>
+        <w:tc>
+          <w:tcPr>
+            <w:tcW w:type="dxa" w:w="2016"/>
+            <w:shd w:val="clear" w:fill="EAEEF3"/>
+          </w:tcPr>
+          <w:p>
+            <w:r>
+              <w:rPr>
+                <w:b/>
+              </w:rPr>
+              <w:t>Size</w:t>
+            </w:r>
+          </w:p>
+        </w:tc>
+        <w:tc>
+          <w:tcPr>
+            <w:tcW w:type="dxa" w:w="6912"/>
+          </w:tcPr>
+          <w:p>
+            <w:r>
+              <w:t>M (~1 day)</w:t>
+            </w:r>
+          </w:p>
+        </w:tc>
+      </w:tr>
+      <w:tr>
+        <w:tc>
+          <w:tcPr>
+            <w:tcW w:type="dxa" w:w="2016"/>
+            <w:shd w:val="clear" w:fill="EAEEF3"/>
+          </w:tcPr>
+          <w:p>
+            <w:r>
+              <w:rPr>
+                <w:b/>
+              </w:rPr>
+              <w:t>Depends on</w:t>
+            </w:r>
+          </w:p>
+        </w:tc>
+        <w:tc>
+          <w:tcPr>
+            <w:tcW w:type="dxa" w:w="6912"/>
+          </w:tcPr>
+          <w:p>
+            <w:r>
+              <w:t>F-01</w:t>
+            </w:r>
+          </w:p>
+        </w:tc>
+      </w:tr>
+      <w:tr>
+        <w:tc>
+          <w:tcPr>
+            <w:tcW w:type="dxa" w:w="2016"/>
+            <w:shd w:val="clear" w:fill="EAEEF3"/>
+          </w:tcPr>
+          <w:p>
+            <w:r>
+              <w:rPr>
+                <w:b/>
+              </w:rPr>
+              <w:t>AI-junior?</w:t>
+            </w:r>
+          </w:p>
+        </w:tc>
+        <w:tc>
+          <w:tcPr>
+            <w:tcW w:type="dxa" w:w="6912"/>
+          </w:tcPr>
+          <w:p>
+            <w:r>
+              <w:t>Yes</w:t>
+            </w:r>
+          </w:p>
+        </w:tc>
+      </w:tr>
+      <w:tr>
+        <w:tc>
+          <w:tcPr>
+            <w:tcW w:type="dxa" w:w="2016"/>
+            <w:shd w:val="clear" w:fill="EAEEF3"/>
+          </w:tcPr>
+          <w:p>
+            <w:r>
+              <w:rPr>
+                <w:b/>
+              </w:rPr>
+              <w:t>Spec refs</w:t>
+            </w:r>
+          </w:p>
+        </w:tc>
+        <w:tc>
+          <w:tcPr>
+            <w:tcW w:type="dxa" w:w="6912"/>
+          </w:tcPr>
+          <w:p>
+            <w:r>
+              <w:t>frontend_spec.md §3</w:t>
+            </w:r>
+          </w:p>
+        </w:tc>
+      </w:tr>
+    </w:tbl>
+    <w:p/>
+    <w:p>
+      <w:r>
+        <w:rPr>
+          <w:b/>
+        </w:rPr>
+        <w:t xml:space="preserve">Description. </w:t>
+      </w:r>
+      <w:r>
+        <w:t>Persistent top bar + sidebar + protected routes.</w:t>
+      </w:r>
+    </w:p>
+    <w:p>
+      <w:pPr>
+        <w:pStyle w:val="IntenseQuote"/>
+      </w:pPr>
+      <w:r>
+        <w:t>Technical notes</w:t>
+      </w:r>
+    </w:p>
+    <w:p>
+      <w:pPr>
+        <w:pStyle w:val="ListBullet"/>
+      </w:pPr>
+      <w:r>
+        <w:t>Top bar (logo, breadcrumb, account); sidebar (Dashboard, Clients); route guard.</w:t>
+      </w:r>
+    </w:p>
+    <w:p>
+      <w:pPr>
+        <w:pStyle w:val="IntenseQuote"/>
+      </w:pPr>
+      <w:r>
+        <w:t>Acceptance criteria</w:t>
+      </w:r>
+    </w:p>
+    <w:p>
+      <w:pPr>
+        <w:pStyle w:val="ListBullet"/>
+      </w:pPr>
+      <w:r>
+        <w:t>☐  Authed users see the shell; unauth redirected.</w:t>
+      </w:r>
+    </w:p>
+    <w:p/>
+    <w:p>
+      <w:pPr>
+        <w:pStyle w:val="Heading3"/>
+      </w:pPr>
+      <w:r>
+        <w:rPr>
+          <w:color w:val="1F3A5F"/>
+        </w:rPr>
+        <w:t>F-04 · UI primitives</w:t>
+      </w:r>
+    </w:p>
+    <w:tbl>
+      <w:tblPr>
+        <w:tblStyle w:val="TableGrid"/>
+        <w:tblW w:type="auto" w:w="0"/>
+        <w:jc w:val="left"/>
+        <w:tblLook w:firstColumn="1" w:firstRow="1" w:lastColumn="0" w:lastRow="0" w:noHBand="0" w:noVBand="1" w:val="04A0"/>
+      </w:tblPr>
+      <w:tblGrid>
+        <w:gridCol w:w="4320"/>
+        <w:gridCol w:w="4320"/>
+      </w:tblGrid>
+      <w:tr>
+        <w:tc>
+          <w:tcPr>
+            <w:tcW w:type="dxa" w:w="2016"/>
+            <w:shd w:val="clear" w:fill="EAEEF3"/>
+          </w:tcPr>
+          <w:p>
+            <w:r>
+              <w:rPr>
+                <w:b/>
+              </w:rPr>
+              <w:t>Tag</w:t>
+            </w:r>
+          </w:p>
+        </w:tc>
+        <w:tc>
+          <w:tcPr>
+            <w:tcW w:type="dxa" w:w="6912"/>
+          </w:tcPr>
+          <w:p>
+            <w:r>
+              <w:t>[S] Shared</w:t>
+            </w:r>
+          </w:p>
+        </w:tc>
+      </w:tr>
+      <w:tr>
+        <w:tc>
+          <w:tcPr>
+            <w:tcW w:type="dxa" w:w="2016"/>
+            <w:shd w:val="clear" w:fill="EAEEF3"/>
+          </w:tcPr>
+          <w:p>
+            <w:r>
+              <w:rPr>
+                <w:b/>
+              </w:rPr>
+              <w:t>Size</w:t>
+            </w:r>
+          </w:p>
+        </w:tc>
+        <w:tc>
+          <w:tcPr>
+            <w:tcW w:type="dxa" w:w="6912"/>
+          </w:tcPr>
+          <w:p>
+            <w:r>
+              <w:t>L (~2 days)</w:t>
+            </w:r>
+          </w:p>
+        </w:tc>
+      </w:tr>
+      <w:tr>
+        <w:tc>
+          <w:tcPr>
+            <w:tcW w:type="dxa" w:w="2016"/>
+            <w:shd w:val="clear" w:fill="EAEEF3"/>
+          </w:tcPr>
+          <w:p>
+            <w:r>
+              <w:rPr>
+                <w:b/>
+              </w:rPr>
+              <w:t>Depends on</w:t>
+            </w:r>
+          </w:p>
+        </w:tc>
+        <w:tc>
+          <w:tcPr>
+            <w:tcW w:type="dxa" w:w="6912"/>
+          </w:tcPr>
+          <w:p>
+            <w:r>
+              <w:t>F-01</w:t>
+            </w:r>
+          </w:p>
+        </w:tc>
+      </w:tr>
+      <w:tr>
+        <w:tc>
+          <w:tcPr>
+            <w:tcW w:type="dxa" w:w="2016"/>
+            <w:shd w:val="clear" w:fill="EAEEF3"/>
+          </w:tcPr>
+          <w:p>
+            <w:r>
+              <w:rPr>
+                <w:b/>
+              </w:rPr>
+              <w:t>AI-junior?</w:t>
+            </w:r>
+          </w:p>
+        </w:tc>
+        <w:tc>
+          <w:tcPr>
+            <w:tcW w:type="dxa" w:w="6912"/>
+          </w:tcPr>
+          <w:p>
+            <w:r>
+              <w:t>Yes</w:t>
+            </w:r>
+          </w:p>
+        </w:tc>
+      </w:tr>
+      <w:tr>
+        <w:tc>
+          <w:tcPr>
+            <w:tcW w:type="dxa" w:w="2016"/>
+            <w:shd w:val="clear" w:fill="EAEEF3"/>
+          </w:tcPr>
+          <w:p>
+            <w:r>
+              <w:rPr>
+                <w:b/>
+              </w:rPr>
+              <w:t>Spec refs</w:t>
+            </w:r>
+          </w:p>
+        </w:tc>
+        <w:tc>
+          <w:tcPr>
+            <w:tcW w:type="dxa" w:w="6912"/>
+          </w:tcPr>
+          <w:p>
+            <w:r>
+              <w:t>frontend_spec.md §2/§10</w:t>
+            </w:r>
+          </w:p>
+        </w:tc>
+      </w:tr>
+    </w:tbl>
+    <w:p/>
+    <w:p>
+      <w:r>
+        <w:rPr>
+          <w:b/>
+        </w:rPr>
+        <w:t xml:space="preserve">Description. </w:t>
+      </w:r>
+      <w:r>
+        <w:t>Reusable components matching the design system.</w:t>
+      </w:r>
+    </w:p>
+    <w:p>
+      <w:pPr>
+        <w:pStyle w:val="IntenseQuote"/>
+      </w:pPr>
+      <w:r>
+        <w:t>Technical notes</w:t>
+      </w:r>
+    </w:p>
+    <w:p>
+      <w:pPr>
+        <w:pStyle w:val="ListBullet"/>
+      </w:pPr>
+      <w:r>
+        <w:t>Button, Card, Badge, Table, Modal, Toast, Input, Toggle, Skeleton, EmptyState.</w:t>
+      </w:r>
+    </w:p>
+    <w:p>
+      <w:pPr>
+        <w:pStyle w:val="IntenseQuote"/>
+      </w:pPr>
+      <w:r>
+        <w:t>Acceptance criteria</w:t>
+      </w:r>
+    </w:p>
+    <w:p>
+      <w:pPr>
+        <w:pStyle w:val="ListBullet"/>
+      </w:pPr>
+      <w:r>
+        <w:t>☐  Primitives render per tokens and are reused across screens.</w:t>
+      </w:r>
+    </w:p>
+    <w:p/>
+    <w:p>
+      <w:pPr>
+        <w:pStyle w:val="Heading2"/>
+      </w:pPr>
+      <w:r>
+        <w:rPr>
+          <w:color w:val="555555"/>
+        </w:rPr>
+        <w:t>Epic FE-B — Auth &amp; dashboard</w:t>
+      </w:r>
+    </w:p>
+    <w:p>
+      <w:pPr>
+        <w:pStyle w:val="Heading3"/>
+      </w:pPr>
+      <w:r>
+        <w:rPr>
+          <w:color w:val="1F3A5F"/>
+        </w:rPr>
+        <w:t>F-05 · Login screen</w:t>
+      </w:r>
+    </w:p>
+    <w:tbl>
+      <w:tblPr>
+        <w:tblStyle w:val="TableGrid"/>
+        <w:tblW w:type="auto" w:w="0"/>
+        <w:jc w:val="left"/>
+        <w:tblLook w:firstColumn="1" w:firstRow="1" w:lastColumn="0" w:lastRow="0" w:noHBand="0" w:noVBand="1" w:val="04A0"/>
+      </w:tblPr>
+      <w:tblGrid>
+        <w:gridCol w:w="4320"/>
+        <w:gridCol w:w="4320"/>
+      </w:tblGrid>
+      <w:tr>
+        <w:tc>
+          <w:tcPr>
+            <w:tcW w:type="dxa" w:w="2016"/>
+            <w:shd w:val="clear" w:fill="EAEEF3"/>
+          </w:tcPr>
+          <w:p>
+            <w:r>
+              <w:rPr>
+                <w:b/>
+              </w:rPr>
+              <w:t>Tag</w:t>
+            </w:r>
+          </w:p>
+        </w:tc>
+        <w:tc>
+          <w:tcPr>
+            <w:tcW w:type="dxa" w:w="6912"/>
+          </w:tcPr>
+          <w:p>
+            <w:r>
+              <w:t>[P] Parallel</w:t>
+            </w:r>
+          </w:p>
+        </w:tc>
+      </w:tr>
+      <w:tr>
+        <w:tc>
+          <w:tcPr>
+            <w:tcW w:type="dxa" w:w="2016"/>
+            <w:shd w:val="clear" w:fill="EAEEF3"/>
+          </w:tcPr>
+          <w:p>
+            <w:r>
+              <w:rPr>
+                <w:b/>
+              </w:rPr>
+              <w:t>Size</w:t>
+            </w:r>
+          </w:p>
+        </w:tc>
+        <w:tc>
+          <w:tcPr>
+            <w:tcW w:type="dxa" w:w="6912"/>
+          </w:tcPr>
+          <w:p>
+            <w:r>
+              <w:t>M (~1 day)</w:t>
+            </w:r>
+          </w:p>
+        </w:tc>
+      </w:tr>
+      <w:tr>
+        <w:tc>
+          <w:tcPr>
+            <w:tcW w:type="dxa" w:w="2016"/>
+            <w:shd w:val="clear" w:fill="EAEEF3"/>
+          </w:tcPr>
+          <w:p>
+            <w:r>
+              <w:rPr>
+                <w:b/>
+              </w:rPr>
+              <w:t>Depends on</w:t>
+            </w:r>
+          </w:p>
+        </w:tc>
+        <w:tc>
+          <w:tcPr>
+            <w:tcW w:type="dxa" w:w="6912"/>
+          </w:tcPr>
+          <w:p>
+            <w:r>
+              <w:t>F-02,F-04</w:t>
+            </w:r>
+          </w:p>
+        </w:tc>
+      </w:tr>
+      <w:tr>
+        <w:tc>
+          <w:tcPr>
+            <w:tcW w:type="dxa" w:w="2016"/>
+            <w:shd w:val="clear" w:fill="EAEEF3"/>
+          </w:tcPr>
+          <w:p>
+            <w:r>
+              <w:rPr>
+                <w:b/>
+              </w:rPr>
+              <w:t>AI-junior?</w:t>
+            </w:r>
+          </w:p>
+        </w:tc>
+        <w:tc>
+          <w:tcPr>
+            <w:tcW w:type="dxa" w:w="6912"/>
+          </w:tcPr>
+          <w:p>
+            <w:r>
+              <w:t>Yes</w:t>
+            </w:r>
+          </w:p>
+        </w:tc>
+      </w:tr>
+      <w:tr>
+        <w:tc>
+          <w:tcPr>
+            <w:tcW w:type="dxa" w:w="2016"/>
+            <w:shd w:val="clear" w:fill="EAEEF3"/>
+          </w:tcPr>
+          <w:p>
+            <w:r>
+              <w:rPr>
+                <w:b/>
+              </w:rPr>
+              <w:t>Spec refs</w:t>
+            </w:r>
+          </w:p>
+        </w:tc>
+        <w:tc>
+          <w:tcPr>
+            <w:tcW w:type="dxa" w:w="6912"/>
+          </w:tcPr>
+          <w:p>
+            <w:r>
+              <w:t>FR-01</w:t>
+            </w:r>
+          </w:p>
+        </w:tc>
+      </w:tr>
+    </w:tbl>
+    <w:p/>
+    <w:p>
+      <w:r>
+        <w:rPr>
+          <w:b/>
+        </w:rPr>
+        <w:t xml:space="preserve">Description. </w:t>
+      </w:r>
+      <w:r>
+        <w:t>Single-account sign-in.</w:t>
+      </w:r>
+    </w:p>
+    <w:p>
+      <w:pPr>
+        <w:pStyle w:val="IntenseQuote"/>
+      </w:pPr>
+      <w:r>
+        <w:t>Technical notes</w:t>
+      </w:r>
+    </w:p>
+    <w:p>
+      <w:pPr>
+        <w:pStyle w:val="ListBullet"/>
+      </w:pPr>
+      <w:r>
+        <w:t>Email+password; error/loading states; success → Dashboard.</w:t>
+      </w:r>
+    </w:p>
+    <w:p>
+      <w:pPr>
+        <w:pStyle w:val="IntenseQuote"/>
+      </w:pPr>
+      <w:r>
+        <w:t>Acceptance criteria</w:t>
+      </w:r>
+    </w:p>
+    <w:p>
+      <w:pPr>
+        <w:pStyle w:val="ListBullet"/>
+      </w:pPr>
+      <w:r>
+        <w:t>☐  Valid login lands on Dashboard; bad creds show inline error.</w:t>
+      </w:r>
+    </w:p>
+    <w:p/>
+    <w:p>
+      <w:pPr>
+        <w:pStyle w:val="Heading3"/>
+      </w:pPr>
+      <w:r>
+        <w:rPr>
+          <w:color w:val="1F3A5F"/>
+        </w:rPr>
+        <w:t>F-06 · Dashboard</w:t>
+      </w:r>
+    </w:p>
+    <w:tbl>
+      <w:tblPr>
+        <w:tblStyle w:val="TableGrid"/>
+        <w:tblW w:type="auto" w:w="0"/>
+        <w:jc w:val="left"/>
+        <w:tblLook w:firstColumn="1" w:firstRow="1" w:lastColumn="0" w:lastRow="0" w:noHBand="0" w:noVBand="1" w:val="04A0"/>
+      </w:tblPr>
+      <w:tblGrid>
+        <w:gridCol w:w="4320"/>
+        <w:gridCol w:w="4320"/>
+      </w:tblGrid>
+      <w:tr>
+        <w:tc>
+          <w:tcPr>
+            <w:tcW w:type="dxa" w:w="2016"/>
+            <w:shd w:val="clear" w:fill="EAEEF3"/>
+          </w:tcPr>
+          <w:p>
+            <w:r>
+              <w:rPr>
+                <w:b/>
+              </w:rPr>
+              <w:t>Tag</w:t>
+            </w:r>
+          </w:p>
+        </w:tc>
+        <w:tc>
+          <w:tcPr>
+            <w:tcW w:type="dxa" w:w="6912"/>
+          </w:tcPr>
+          <w:p>
+            <w:r>
+              <w:t>[P] Parallel</w:t>
+            </w:r>
+          </w:p>
+        </w:tc>
+      </w:tr>
+      <w:tr>
+        <w:tc>
+          <w:tcPr>
+            <w:tcW w:type="dxa" w:w="2016"/>
+            <w:shd w:val="clear" w:fill="EAEEF3"/>
+          </w:tcPr>
+          <w:p>
+            <w:r>
+              <w:rPr>
+                <w:b/>
+              </w:rPr>
+              <w:t>Size</w:t>
+            </w:r>
+          </w:p>
+        </w:tc>
+        <w:tc>
+          <w:tcPr>
+            <w:tcW w:type="dxa" w:w="6912"/>
+          </w:tcPr>
+          <w:p>
+            <w:r>
+              <w:t>L (~2 days)</w:t>
+            </w:r>
+          </w:p>
+        </w:tc>
+      </w:tr>
+      <w:tr>
+        <w:tc>
+          <w:tcPr>
+            <w:tcW w:type="dxa" w:w="2016"/>
+            <w:shd w:val="clear" w:fill="EAEEF3"/>
+          </w:tcPr>
+          <w:p>
+            <w:r>
+              <w:rPr>
+                <w:b/>
+              </w:rPr>
+              <w:t>Depends on</w:t>
+            </w:r>
+          </w:p>
+        </w:tc>
+        <w:tc>
+          <w:tcPr>
+            <w:tcW w:type="dxa" w:w="6912"/>
+          </w:tcPr>
+          <w:p>
+            <w:r>
+              <w:t>F-03,F-04</w:t>
+            </w:r>
+          </w:p>
+        </w:tc>
+      </w:tr>
+      <w:tr>
+        <w:tc>
+          <w:tcPr>
+            <w:tcW w:type="dxa" w:w="2016"/>
+            <w:shd w:val="clear" w:fill="EAEEF3"/>
+          </w:tcPr>
+          <w:p>
+            <w:r>
+              <w:rPr>
+                <w:b/>
+              </w:rPr>
+              <w:t>AI-junior?</w:t>
+            </w:r>
+          </w:p>
+        </w:tc>
+        <w:tc>
+          <w:tcPr>
+            <w:tcW w:type="dxa" w:w="6912"/>
+          </w:tcPr>
+          <w:p>
+            <w:r>
+              <w:t>Partial</w:t>
+            </w:r>
+          </w:p>
+        </w:tc>
+      </w:tr>
+      <w:tr>
+        <w:tc>
+          <w:tcPr>
+            <w:tcW w:type="dxa" w:w="2016"/>
+            <w:shd w:val="clear" w:fill="EAEEF3"/>
+          </w:tcPr>
+          <w:p>
+            <w:r>
+              <w:rPr>
+                <w:b/>
+              </w:rPr>
+              <w:t>Spec refs</w:t>
+            </w:r>
+          </w:p>
+        </w:tc>
+        <w:tc>
+          <w:tcPr>
+            <w:tcW w:type="dxa" w:w="6912"/>
+          </w:tcPr>
+          <w:p>
+            <w:r>
+              <w:t>frontend_spec.md §5</w:t>
+            </w:r>
+          </w:p>
+        </w:tc>
+      </w:tr>
+    </w:tbl>
+    <w:p/>
+    <w:p>
+      <w:r>
+        <w:rPr>
+          <w:b/>
+        </w:rPr>
+        <w:t xml:space="preserve">Description. </w:t>
+      </w:r>
+      <w:r>
+        <w:t>Overview with stats and client cards.</w:t>
+      </w:r>
+    </w:p>
+    <w:p>
+      <w:pPr>
+        <w:pStyle w:val="IntenseQuote"/>
+      </w:pPr>
+      <w:r>
+        <w:t>Technical notes</w:t>
+      </w:r>
+    </w:p>
+    <w:p>
+      <w:pPr>
+        <w:pStyle w:val="ListBullet"/>
+      </w:pPr>
+      <w:r>
+        <w:t>4 stat tiles; how-it-works; clickable client cards; empty state.</w:t>
+      </w:r>
+    </w:p>
+    <w:p>
+      <w:pPr>
+        <w:pStyle w:val="IntenseQuote"/>
+      </w:pPr>
+      <w:r>
+        <w:t>Acceptance criteria</w:t>
+      </w:r>
+    </w:p>
+    <w:p>
+      <w:pPr>
+        <w:pStyle w:val="ListBullet"/>
+      </w:pPr>
+      <w:r>
+        <w:t>☐  Stats render; clicking a card opens client detail.</w:t>
+      </w:r>
+    </w:p>
+    <w:p/>
+    <w:p>
+      <w:pPr>
+        <w:pStyle w:val="Heading2"/>
+      </w:pPr>
+      <w:r>
+        <w:rPr>
+          <w:color w:val="555555"/>
+        </w:rPr>
+        <w:t>Epic FE-C — Clients &amp; config</w:t>
+      </w:r>
+    </w:p>
+    <w:p>
+      <w:pPr>
+        <w:pStyle w:val="Heading3"/>
+      </w:pPr>
+      <w:r>
+        <w:rPr>
+          <w:color w:val="1F3A5F"/>
+        </w:rPr>
+        <w:t>F-07 · Clients list</w:t>
+      </w:r>
+    </w:p>
+    <w:tbl>
+      <w:tblPr>
+        <w:tblStyle w:val="TableGrid"/>
+        <w:tblW w:type="auto" w:w="0"/>
+        <w:jc w:val="left"/>
+        <w:tblLook w:firstColumn="1" w:firstRow="1" w:lastColumn="0" w:lastRow="0" w:noHBand="0" w:noVBand="1" w:val="04A0"/>
+      </w:tblPr>
+      <w:tblGrid>
+        <w:gridCol w:w="4320"/>
+        <w:gridCol w:w="4320"/>
+      </w:tblGrid>
+      <w:tr>
+        <w:tc>
+          <w:tcPr>
+            <w:tcW w:type="dxa" w:w="2016"/>
+            <w:shd w:val="clear" w:fill="EAEEF3"/>
+          </w:tcPr>
+          <w:p>
+            <w:r>
+              <w:rPr>
+                <w:b/>
+              </w:rPr>
+              <w:t>Tag</w:t>
+            </w:r>
+          </w:p>
+        </w:tc>
+        <w:tc>
+          <w:tcPr>
+            <w:tcW w:type="dxa" w:w="6912"/>
+          </w:tcPr>
+          <w:p>
+            <w:r>
+              <w:t>[P] Parallel</w:t>
+            </w:r>
+          </w:p>
+        </w:tc>
+      </w:tr>
+      <w:tr>
+        <w:tc>
+          <w:tcPr>
+            <w:tcW w:type="dxa" w:w="2016"/>
+            <w:shd w:val="clear" w:fill="EAEEF3"/>
+          </w:tcPr>
+          <w:p>
+            <w:r>
+              <w:rPr>
+                <w:b/>
+              </w:rPr>
+              <w:t>Size</w:t>
+            </w:r>
+          </w:p>
+        </w:tc>
+        <w:tc>
+          <w:tcPr>
+            <w:tcW w:type="dxa" w:w="6912"/>
+          </w:tcPr>
+          <w:p>
+            <w:r>
+              <w:t>M (~1 day)</w:t>
+            </w:r>
+          </w:p>
+        </w:tc>
+      </w:tr>
+      <w:tr>
+        <w:tc>
+          <w:tcPr>
+            <w:tcW w:type="dxa" w:w="2016"/>
+            <w:shd w:val="clear" w:fill="EAEEF3"/>
+          </w:tcPr>
+          <w:p>
+            <w:r>
+              <w:rPr>
+                <w:b/>
+              </w:rPr>
+              <w:t>Depends on</w:t>
+            </w:r>
+          </w:p>
+        </w:tc>
+        <w:tc>
+          <w:tcPr>
+            <w:tcW w:type="dxa" w:w="6912"/>
+          </w:tcPr>
+          <w:p>
+            <w:r>
+              <w:t>F-04</w:t>
+            </w:r>
+          </w:p>
+        </w:tc>
+      </w:tr>
+      <w:tr>
+        <w:tc>
+          <w:tcPr>
+            <w:tcW w:type="dxa" w:w="2016"/>
+            <w:shd w:val="clear" w:fill="EAEEF3"/>
+          </w:tcPr>
+          <w:p>
+            <w:r>
+              <w:rPr>
+                <w:b/>
+              </w:rPr>
+              <w:t>AI-junior?</w:t>
+            </w:r>
+          </w:p>
+        </w:tc>
+        <w:tc>
+          <w:tcPr>
+            <w:tcW w:type="dxa" w:w="6912"/>
+          </w:tcPr>
+          <w:p>
+            <w:r>
+              <w:t>Yes</w:t>
+            </w:r>
+          </w:p>
+        </w:tc>
+      </w:tr>
+      <w:tr>
+        <w:tc>
+          <w:tcPr>
+            <w:tcW w:type="dxa" w:w="2016"/>
+            <w:shd w:val="clear" w:fill="EAEEF3"/>
+          </w:tcPr>
+          <w:p>
+            <w:r>
+              <w:rPr>
+                <w:b/>
+              </w:rPr>
+              <w:t>Spec refs</w:t>
+            </w:r>
+          </w:p>
+        </w:tc>
+        <w:tc>
+          <w:tcPr>
+            <w:tcW w:type="dxa" w:w="6912"/>
+          </w:tcPr>
+          <w:p>
+            <w:r>
+              <w:t>FR-15</w:t>
+            </w:r>
+          </w:p>
+        </w:tc>
+      </w:tr>
+    </w:tbl>
+    <w:p/>
+    <w:p>
+      <w:r>
+        <w:rPr>
+          <w:b/>
+        </w:rPr>
+        <w:t xml:space="preserve">Description. </w:t>
+      </w:r>
+      <w:r>
+        <w:t>Table of all tenants.</w:t>
+      </w:r>
+    </w:p>
+    <w:p>
+      <w:pPr>
+        <w:pStyle w:val="IntenseQuote"/>
+      </w:pPr>
+      <w:r>
+        <w:t>Technical notes</w:t>
+      </w:r>
+    </w:p>
+    <w:p>
+      <w:pPr>
+        <w:pStyle w:val="ListBullet"/>
+      </w:pPr>
+      <w:r>
+        <w:t>Columns per spec; row click → detail; empty state; New client button.</w:t>
+      </w:r>
+    </w:p>
+    <w:p>
+      <w:pPr>
+        <w:pStyle w:val="IntenseQuote"/>
+      </w:pPr>
+      <w:r>
+        <w:t>Acceptance criteria</w:t>
+      </w:r>
+    </w:p>
+    <w:p>
+      <w:pPr>
+        <w:pStyle w:val="ListBullet"/>
+      </w:pPr>
+      <w:r>
+        <w:t>☐  Clients listed; row opens detail.</w:t>
+      </w:r>
+    </w:p>
+    <w:p/>
+    <w:p>
+      <w:pPr>
+        <w:pStyle w:val="Heading3"/>
+      </w:pPr>
+      <w:r>
+        <w:rPr>
+          <w:color w:val="1F3A5F"/>
+        </w:rPr>
+        <w:t>F-08 · Create client modal</w:t>
+      </w:r>
+    </w:p>
+    <w:tbl>
+      <w:tblPr>
+        <w:tblStyle w:val="TableGrid"/>
+        <w:tblW w:type="auto" w:w="0"/>
+        <w:jc w:val="left"/>
+        <w:tblLook w:firstColumn="1" w:firstRow="1" w:lastColumn="0" w:lastRow="0" w:noHBand="0" w:noVBand="1" w:val="04A0"/>
+      </w:tblPr>
+      <w:tblGrid>
+        <w:gridCol w:w="4320"/>
+        <w:gridCol w:w="4320"/>
+      </w:tblGrid>
+      <w:tr>
+        <w:tc>
+          <w:tcPr>
+            <w:tcW w:type="dxa" w:w="2016"/>
+            <w:shd w:val="clear" w:fill="EAEEF3"/>
+          </w:tcPr>
+          <w:p>
+            <w:r>
+              <w:rPr>
+                <w:b/>
+              </w:rPr>
+              <w:t>Tag</w:t>
+            </w:r>
+          </w:p>
+        </w:tc>
+        <w:tc>
+          <w:tcPr>
+            <w:tcW w:type="dxa" w:w="6912"/>
+          </w:tcPr>
+          <w:p>
+            <w:r>
+              <w:t>[P] Parallel</w:t>
+            </w:r>
+          </w:p>
+        </w:tc>
+      </w:tr>
+      <w:tr>
+        <w:tc>
+          <w:tcPr>
+            <w:tcW w:type="dxa" w:w="2016"/>
+            <w:shd w:val="clear" w:fill="EAEEF3"/>
+          </w:tcPr>
+          <w:p>
+            <w:r>
+              <w:rPr>
+                <w:b/>
+              </w:rPr>
+              <w:t>Size</w:t>
+            </w:r>
+          </w:p>
+        </w:tc>
+        <w:tc>
+          <w:tcPr>
+            <w:tcW w:type="dxa" w:w="6912"/>
+          </w:tcPr>
+          <w:p>
+            <w:r>
+              <w:t>M (~1 day)</w:t>
+            </w:r>
+          </w:p>
+        </w:tc>
+      </w:tr>
+      <w:tr>
+        <w:tc>
+          <w:tcPr>
+            <w:tcW w:type="dxa" w:w="2016"/>
+            <w:shd w:val="clear" w:fill="EAEEF3"/>
+          </w:tcPr>
+          <w:p>
+            <w:r>
+              <w:rPr>
+                <w:b/>
+              </w:rPr>
+              <w:t>Depends on</w:t>
+            </w:r>
+          </w:p>
+        </w:tc>
+        <w:tc>
+          <w:tcPr>
+            <w:tcW w:type="dxa" w:w="6912"/>
+          </w:tcPr>
+          <w:p>
+            <w:r>
+              <w:t>F-07</w:t>
+            </w:r>
+          </w:p>
+        </w:tc>
+      </w:tr>
+      <w:tr>
+        <w:tc>
+          <w:tcPr>
+            <w:tcW w:type="dxa" w:w="2016"/>
+            <w:shd w:val="clear" w:fill="EAEEF3"/>
+          </w:tcPr>
+          <w:p>
+            <w:r>
+              <w:rPr>
+                <w:b/>
+              </w:rPr>
+              <w:t>AI-junior?</w:t>
+            </w:r>
+          </w:p>
+        </w:tc>
+        <w:tc>
+          <w:tcPr>
+            <w:tcW w:type="dxa" w:w="6912"/>
+          </w:tcPr>
+          <w:p>
+            <w:r>
+              <w:t>Yes</w:t>
+            </w:r>
+          </w:p>
+        </w:tc>
+      </w:tr>
+      <w:tr>
+        <w:tc>
+          <w:tcPr>
+            <w:tcW w:type="dxa" w:w="2016"/>
+            <w:shd w:val="clear" w:fill="EAEEF3"/>
+          </w:tcPr>
+          <w:p>
+            <w:r>
+              <w:rPr>
+                <w:b/>
+              </w:rPr>
+              <w:t>Spec refs</w:t>
+            </w:r>
+          </w:p>
+        </w:tc>
+        <w:tc>
+          <w:tcPr>
+            <w:tcW w:type="dxa" w:w="6912"/>
+          </w:tcPr>
+          <w:p>
+            <w:r>
+              <w:t>FR-16</w:t>
+            </w:r>
+          </w:p>
+        </w:tc>
+      </w:tr>
+    </w:tbl>
+    <w:p/>
+    <w:p>
+      <w:r>
+        <w:rPr>
+          <w:b/>
+        </w:rPr>
+        <w:t xml:space="preserve">Description. </w:t>
+      </w:r>
+      <w:r>
+        <w:t>Create a tenant from the list.</w:t>
+      </w:r>
+    </w:p>
+    <w:p>
+      <w:pPr>
+        <w:pStyle w:val="IntenseQuote"/>
+      </w:pPr>
+      <w:r>
+        <w:t>Technical notes</w:t>
+      </w:r>
+    </w:p>
+    <w:p>
+      <w:pPr>
+        <w:pStyle w:val="ListBullet"/>
+      </w:pPr>
+      <w:r>
+        <w:t>Fields + validation (name ≥2 enables Create); toast; navigate to detail.</w:t>
+      </w:r>
+    </w:p>
+    <w:p>
+      <w:pPr>
+        <w:pStyle w:val="IntenseQuote"/>
+      </w:pPr>
+      <w:r>
+        <w:t>Acceptance criteria</w:t>
+      </w:r>
+    </w:p>
+    <w:p>
+      <w:pPr>
+        <w:pStyle w:val="ListBullet"/>
+      </w:pPr>
+      <w:r>
+        <w:t>☐  New client created and opened in Flow builder tab.</w:t>
+      </w:r>
+    </w:p>
+    <w:p/>
+    <w:p>
+      <w:pPr>
+        <w:pStyle w:val="Heading3"/>
+      </w:pPr>
+      <w:r>
+        <w:rPr>
+          <w:color w:val="1F3A5F"/>
+        </w:rPr>
+        <w:t>F-09 · Client detail shell + tabs</w:t>
+      </w:r>
+    </w:p>
+    <w:tbl>
+      <w:tblPr>
+        <w:tblStyle w:val="TableGrid"/>
+        <w:tblW w:type="auto" w:w="0"/>
+        <w:jc w:val="left"/>
+        <w:tblLook w:firstColumn="1" w:firstRow="1" w:lastColumn="0" w:lastRow="0" w:noHBand="0" w:noVBand="1" w:val="04A0"/>
+      </w:tblPr>
+      <w:tblGrid>
+        <w:gridCol w:w="4320"/>
+        <w:gridCol w:w="4320"/>
+      </w:tblGrid>
+      <w:tr>
+        <w:tc>
+          <w:tcPr>
+            <w:tcW w:type="dxa" w:w="2016"/>
+            <w:shd w:val="clear" w:fill="EAEEF3"/>
+          </w:tcPr>
+          <w:p>
+            <w:r>
+              <w:rPr>
+                <w:b/>
+              </w:rPr>
+              <w:t>Tag</w:t>
+            </w:r>
+          </w:p>
+        </w:tc>
+        <w:tc>
+          <w:tcPr>
+            <w:tcW w:type="dxa" w:w="6912"/>
+          </w:tcPr>
+          <w:p>
+            <w:r>
+              <w:t>[P] Parallel</w:t>
+            </w:r>
+          </w:p>
+        </w:tc>
+      </w:tr>
+      <w:tr>
+        <w:tc>
+          <w:tcPr>
+            <w:tcW w:type="dxa" w:w="2016"/>
+            <w:shd w:val="clear" w:fill="EAEEF3"/>
+          </w:tcPr>
+          <w:p>
+            <w:r>
+              <w:rPr>
+                <w:b/>
+              </w:rPr>
+              <w:t>Size</w:t>
+            </w:r>
+          </w:p>
+        </w:tc>
+        <w:tc>
+          <w:tcPr>
+            <w:tcW w:type="dxa" w:w="6912"/>
+          </w:tcPr>
+          <w:p>
+            <w:r>
+              <w:t>M (~1 day)</w:t>
+            </w:r>
+          </w:p>
+        </w:tc>
+      </w:tr>
+      <w:tr>
+        <w:tc>
+          <w:tcPr>
+            <w:tcW w:type="dxa" w:w="2016"/>
+            <w:shd w:val="clear" w:fill="EAEEF3"/>
+          </w:tcPr>
+          <w:p>
+            <w:r>
+              <w:rPr>
+                <w:b/>
+              </w:rPr>
+              <w:t>Depends on</w:t>
+            </w:r>
+          </w:p>
+        </w:tc>
+        <w:tc>
+          <w:tcPr>
+            <w:tcW w:type="dxa" w:w="6912"/>
+          </w:tcPr>
+          <w:p>
+            <w:r>
+              <w:t>F-03</w:t>
+            </w:r>
+          </w:p>
+        </w:tc>
+      </w:tr>
+      <w:tr>
+        <w:tc>
+          <w:tcPr>
+            <w:tcW w:type="dxa" w:w="2016"/>
+            <w:shd w:val="clear" w:fill="EAEEF3"/>
+          </w:tcPr>
+          <w:p>
+            <w:r>
+              <w:rPr>
+                <w:b/>
+              </w:rPr>
+              <w:t>AI-junior?</w:t>
+            </w:r>
+          </w:p>
+        </w:tc>
+        <w:tc>
+          <w:tcPr>
+            <w:tcW w:type="dxa" w:w="6912"/>
+          </w:tcPr>
+          <w:p>
+            <w:r>
+              <w:t>Yes</w:t>
+            </w:r>
+          </w:p>
+        </w:tc>
+      </w:tr>
+      <w:tr>
+        <w:tc>
+          <w:tcPr>
+            <w:tcW w:type="dxa" w:w="2016"/>
+            <w:shd w:val="clear" w:fill="EAEEF3"/>
+          </w:tcPr>
+          <w:p>
+            <w:r>
+              <w:rPr>
+                <w:b/>
+              </w:rPr>
+              <w:t>Spec refs</w:t>
+            </w:r>
+          </w:p>
+        </w:tc>
+        <w:tc>
+          <w:tcPr>
+            <w:tcW w:type="dxa" w:w="6912"/>
+          </w:tcPr>
+          <w:p>
+            <w:r>
+              <w:t>frontend_spec.md §3</w:t>
+            </w:r>
+          </w:p>
+        </w:tc>
+      </w:tr>
+    </w:tbl>
+    <w:p/>
+    <w:p>
+      <w:r>
+        <w:rPr>
+          <w:b/>
+        </w:rPr>
+        <w:t xml:space="preserve">Description. </w:t>
+      </w:r>
+      <w:r>
+        <w:t>Detail header + the three tabs.</w:t>
+      </w:r>
+    </w:p>
+    <w:p>
+      <w:pPr>
+        <w:pStyle w:val="IntenseQuote"/>
+      </w:pPr>
+      <w:r>
+        <w:t>Technical notes</w:t>
+      </w:r>
+    </w:p>
+    <w:p>
+      <w:pPr>
+        <w:pStyle w:val="ListBullet"/>
+      </w:pPr>
+      <w:r>
+        <w:t>Header (emoji, name, status, back); Settings/Flow builder/Conversations.</w:t>
+      </w:r>
+    </w:p>
+    <w:p>
+      <w:pPr>
+        <w:pStyle w:val="IntenseQuote"/>
+      </w:pPr>
+      <w:r>
+        <w:t>Acceptance criteria</w:t>
+      </w:r>
+    </w:p>
+    <w:p>
+      <w:pPr>
+        <w:pStyle w:val="ListBullet"/>
+      </w:pPr>
+      <w:r>
+        <w:t>☐  Tabs switch; defaults to Flow builder.</w:t>
+      </w:r>
+    </w:p>
+    <w:p/>
+    <w:p>
+      <w:pPr>
+        <w:pStyle w:val="Heading3"/>
+      </w:pPr>
+      <w:r>
+        <w:rPr>
+          <w:color w:val="1F3A5F"/>
+        </w:rPr>
+        <w:t>F-10 · Settings tab</w:t>
+      </w:r>
+    </w:p>
+    <w:tbl>
+      <w:tblPr>
+        <w:tblStyle w:val="TableGrid"/>
+        <w:tblW w:type="auto" w:w="0"/>
+        <w:jc w:val="left"/>
+        <w:tblLook w:firstColumn="1" w:firstRow="1" w:lastColumn="0" w:lastRow="0" w:noHBand="0" w:noVBand="1" w:val="04A0"/>
+      </w:tblPr>
+      <w:tblGrid>
+        <w:gridCol w:w="4320"/>
+        <w:gridCol w:w="4320"/>
+      </w:tblGrid>
+      <w:tr>
+        <w:tc>
+          <w:tcPr>
+            <w:tcW w:type="dxa" w:w="2016"/>
+            <w:shd w:val="clear" w:fill="EAEEF3"/>
+          </w:tcPr>
+          <w:p>
+            <w:r>
+              <w:rPr>
+                <w:b/>
+              </w:rPr>
+              <w:t>Tag</w:t>
+            </w:r>
+          </w:p>
+        </w:tc>
+        <w:tc>
+          <w:tcPr>
+            <w:tcW w:type="dxa" w:w="6912"/>
+          </w:tcPr>
+          <w:p>
+            <w:r>
+              <w:t>[P] Parallel</w:t>
+            </w:r>
+          </w:p>
+        </w:tc>
+      </w:tr>
+      <w:tr>
+        <w:tc>
+          <w:tcPr>
+            <w:tcW w:type="dxa" w:w="2016"/>
+            <w:shd w:val="clear" w:fill="EAEEF3"/>
+          </w:tcPr>
+          <w:p>
+            <w:r>
+              <w:rPr>
+                <w:b/>
+              </w:rPr>
+              <w:t>Size</w:t>
+            </w:r>
+          </w:p>
+        </w:tc>
+        <w:tc>
+          <w:tcPr>
+            <w:tcW w:type="dxa" w:w="6912"/>
+          </w:tcPr>
+          <w:p>
+            <w:r>
+              <w:t>L (~2 days)</w:t>
+            </w:r>
+          </w:p>
+        </w:tc>
+      </w:tr>
+      <w:tr>
+        <w:tc>
+          <w:tcPr>
+            <w:tcW w:type="dxa" w:w="2016"/>
+            <w:shd w:val="clear" w:fill="EAEEF3"/>
+          </w:tcPr>
+          <w:p>
+            <w:r>
+              <w:rPr>
+                <w:b/>
+              </w:rPr>
+              <w:t>Depends on</w:t>
+            </w:r>
+          </w:p>
+        </w:tc>
+        <w:tc>
+          <w:tcPr>
+            <w:tcW w:type="dxa" w:w="6912"/>
+          </w:tcPr>
+          <w:p>
+            <w:r>
+              <w:t>F-09,F-04</w:t>
+            </w:r>
+          </w:p>
+        </w:tc>
+      </w:tr>
+      <w:tr>
+        <w:tc>
+          <w:tcPr>
+            <w:tcW w:type="dxa" w:w="2016"/>
+            <w:shd w:val="clear" w:fill="EAEEF3"/>
+          </w:tcPr>
+          <w:p>
+            <w:r>
+              <w:rPr>
+                <w:b/>
+              </w:rPr>
+              <w:t>AI-junior?</w:t>
+            </w:r>
+          </w:p>
+        </w:tc>
+        <w:tc>
+          <w:tcPr>
+            <w:tcW w:type="dxa" w:w="6912"/>
+          </w:tcPr>
+          <w:p>
+            <w:r>
+              <w:t>Partial</w:t>
+            </w:r>
+          </w:p>
+        </w:tc>
+      </w:tr>
+      <w:tr>
+        <w:tc>
+          <w:tcPr>
+            <w:tcW w:type="dxa" w:w="2016"/>
+            <w:shd w:val="clear" w:fill="EAEEF3"/>
+          </w:tcPr>
+          <w:p>
+            <w:r>
+              <w:rPr>
+                <w:b/>
+              </w:rPr>
+              <w:t>Spec refs</w:t>
+            </w:r>
+          </w:p>
+        </w:tc>
+        <w:tc>
+          <w:tcPr>
+            <w:tcW w:type="dxa" w:w="6912"/>
+          </w:tcPr>
+          <w:p>
+            <w:r>
+              <w:t>FR-05/11/12</w:t>
+            </w:r>
+          </w:p>
+        </w:tc>
+      </w:tr>
+    </w:tbl>
+    <w:p/>
+    <w:p>
+      <w:r>
+        <w:rPr>
+          <w:b/>
+        </w:rPr>
+        <w:t xml:space="preserve">Description. </w:t>
+      </w:r>
+      <w:r>
+        <w:t>Per-client configuration.</w:t>
+      </w:r>
+    </w:p>
+    <w:p>
+      <w:pPr>
+        <w:pStyle w:val="IntenseQuote"/>
+      </w:pPr>
+      <w:r>
+        <w:t>Technical notes</w:t>
+      </w:r>
+    </w:p>
+    <w:p>
+      <w:pPr>
+        <w:pStyle w:val="ListBullet"/>
+      </w:pPr>
+      <w:r>
+        <w:t>Greeting/closing; handoff toggle reveals email (+warning); channels &amp; identity.</w:t>
+      </w:r>
+    </w:p>
+    <w:p>
+      <w:pPr>
+        <w:pStyle w:val="IntenseQuote"/>
+      </w:pPr>
+      <w:r>
+        <w:t>Acceptance criteria</w:t>
+      </w:r>
+    </w:p>
+    <w:p>
+      <w:pPr>
+        <w:pStyle w:val="ListBullet"/>
+      </w:pPr>
+      <w:r>
+        <w:t>☐  Settings save and reflect on reload.</w:t>
+      </w:r>
+    </w:p>
+    <w:p/>
+    <w:p>
+      <w:pPr>
+        <w:pStyle w:val="Heading2"/>
+      </w:pPr>
+      <w:r>
+        <w:rPr>
+          <w:color w:val="555555"/>
+        </w:rPr>
+        <w:t>Epic FE-D — Flow builder (hardest)</w:t>
+      </w:r>
+    </w:p>
+    <w:p>
+      <w:pPr>
+        <w:pStyle w:val="Heading3"/>
+      </w:pPr>
+      <w:r>
+        <w:rPr>
+          <w:color w:val="1F3A5F"/>
+        </w:rPr>
+        <w:t>F-11 · Step list (collapsed)</w:t>
+      </w:r>
+    </w:p>
+    <w:tbl>
+      <w:tblPr>
+        <w:tblStyle w:val="TableGrid"/>
+        <w:tblW w:type="auto" w:w="0"/>
+        <w:jc w:val="left"/>
+        <w:tblLook w:firstColumn="1" w:firstRow="1" w:lastColumn="0" w:lastRow="0" w:noHBand="0" w:noVBand="1" w:val="04A0"/>
+      </w:tblPr>
+      <w:tblGrid>
+        <w:gridCol w:w="4320"/>
+        <w:gridCol w:w="4320"/>
+      </w:tblGrid>
+      <w:tr>
+        <w:tc>
+          <w:tcPr>
+            <w:tcW w:type="dxa" w:w="2016"/>
+            <w:shd w:val="clear" w:fill="EAEEF3"/>
+          </w:tcPr>
+          <w:p>
+            <w:r>
+              <w:rPr>
+                <w:b/>
+              </w:rPr>
+              <w:t>Tag</w:t>
+            </w:r>
+          </w:p>
+        </w:tc>
+        <w:tc>
+          <w:tcPr>
+            <w:tcW w:type="dxa" w:w="6912"/>
+          </w:tcPr>
+          <w:p>
+            <w:r>
+              <w:t>[D] Dependent</w:t>
+            </w:r>
+          </w:p>
+        </w:tc>
+      </w:tr>
+      <w:tr>
+        <w:tc>
+          <w:tcPr>
+            <w:tcW w:type="dxa" w:w="2016"/>
+            <w:shd w:val="clear" w:fill="EAEEF3"/>
+          </w:tcPr>
+          <w:p>
+            <w:r>
+              <w:rPr>
+                <w:b/>
+              </w:rPr>
+              <w:t>Size</w:t>
+            </w:r>
+          </w:p>
+        </w:tc>
+        <w:tc>
+          <w:tcPr>
+            <w:tcW w:type="dxa" w:w="6912"/>
+          </w:tcPr>
+          <w:p>
+            <w:r>
+              <w:t>L (~2 days)</w:t>
+            </w:r>
+          </w:p>
+        </w:tc>
+      </w:tr>
+      <w:tr>
+        <w:tc>
+          <w:tcPr>
+            <w:tcW w:type="dxa" w:w="2016"/>
+            <w:shd w:val="clear" w:fill="EAEEF3"/>
+          </w:tcPr>
+          <w:p>
+            <w:r>
+              <w:rPr>
+                <w:b/>
+              </w:rPr>
+              <w:t>Depends on</w:t>
+            </w:r>
+          </w:p>
+        </w:tc>
+        <w:tc>
+          <w:tcPr>
+            <w:tcW w:type="dxa" w:w="6912"/>
+          </w:tcPr>
+          <w:p>
+            <w:r>
+              <w:t>F-09</w:t>
+            </w:r>
+          </w:p>
+        </w:tc>
+      </w:tr>
+      <w:tr>
+        <w:tc>
+          <w:tcPr>
+            <w:tcW w:type="dxa" w:w="2016"/>
+            <w:shd w:val="clear" w:fill="EAEEF3"/>
+          </w:tcPr>
+          <w:p>
+            <w:r>
+              <w:rPr>
+                <w:b/>
+              </w:rPr>
+              <w:t>AI-junior?</w:t>
+            </w:r>
+          </w:p>
+        </w:tc>
+        <w:tc>
+          <w:tcPr>
+            <w:tcW w:type="dxa" w:w="6912"/>
+          </w:tcPr>
+          <w:p>
+            <w:r>
+              <w:t>Partial</w:t>
+            </w:r>
+          </w:p>
+        </w:tc>
+      </w:tr>
+      <w:tr>
+        <w:tc>
+          <w:tcPr>
+            <w:tcW w:type="dxa" w:w="2016"/>
+            <w:shd w:val="clear" w:fill="EAEEF3"/>
+          </w:tcPr>
+          <w:p>
+            <w:r>
+              <w:rPr>
+                <w:b/>
+              </w:rPr>
+              <w:t>Spec refs</w:t>
+            </w:r>
+          </w:p>
+        </w:tc>
+        <w:tc>
+          <w:tcPr>
+            <w:tcW w:type="dxa" w:w="6912"/>
+          </w:tcPr>
+          <w:p>
+            <w:r>
+              <w:t>FR-17 / spec §8a</w:t>
+            </w:r>
+          </w:p>
+        </w:tc>
+      </w:tr>
+    </w:tbl>
+    <w:p/>
+    <w:p>
+      <w:r>
+        <w:rPr>
+          <w:b/>
+        </w:rPr>
+        <w:t xml:space="preserve">Description. </w:t>
+      </w:r>
+      <w:r>
+        <w:t>Browse-mode list of step cards.</w:t>
+      </w:r>
+    </w:p>
+    <w:p>
+      <w:pPr>
+        <w:pStyle w:val="IntenseQuote"/>
+      </w:pPr>
+      <w:r>
+        <w:t>Technical notes</w:t>
+      </w:r>
+    </w:p>
+    <w:p>
+      <w:pPr>
+        <w:pStyle w:val="ListBullet"/>
+      </w:pPr>
+      <w:r>
+        <w:t>Mono ID, label, START/END badge, option count, option map; Add step.</w:t>
+      </w:r>
+    </w:p>
+    <w:p>
+      <w:pPr>
+        <w:pStyle w:val="IntenseQuote"/>
+      </w:pPr>
+      <w:r>
+        <w:t>Acceptance criteria</w:t>
+      </w:r>
+    </w:p>
+    <w:p>
+      <w:pPr>
+        <w:pStyle w:val="ListBullet"/>
+      </w:pPr>
+      <w:r>
+        <w:t>☐  Steps render with their option maps.</w:t>
+      </w:r>
+    </w:p>
+    <w:p/>
+    <w:p>
+      <w:pPr>
+        <w:pStyle w:val="Heading3"/>
+      </w:pPr>
+      <w:r>
+        <w:rPr>
+          <w:color w:val="1F3A5F"/>
+        </w:rPr>
+        <w:t>F-12 · Step editor (expanded)</w:t>
+      </w:r>
+    </w:p>
+    <w:tbl>
+      <w:tblPr>
+        <w:tblStyle w:val="TableGrid"/>
+        <w:tblW w:type="auto" w:w="0"/>
+        <w:jc w:val="left"/>
+        <w:tblLook w:firstColumn="1" w:firstRow="1" w:lastColumn="0" w:lastRow="0" w:noHBand="0" w:noVBand="1" w:val="04A0"/>
+      </w:tblPr>
+      <w:tblGrid>
+        <w:gridCol w:w="4320"/>
+        <w:gridCol w:w="4320"/>
+      </w:tblGrid>
+      <w:tr>
+        <w:tc>
+          <w:tcPr>
+            <w:tcW w:type="dxa" w:w="2016"/>
+            <w:shd w:val="clear" w:fill="EAEEF3"/>
+          </w:tcPr>
+          <w:p>
+            <w:r>
+              <w:rPr>
+                <w:b/>
+              </w:rPr>
+              <w:t>Tag</w:t>
+            </w:r>
+          </w:p>
+        </w:tc>
+        <w:tc>
+          <w:tcPr>
+            <w:tcW w:type="dxa" w:w="6912"/>
+          </w:tcPr>
+          <w:p>
+            <w:r>
+              <w:t>[D] Dependent</w:t>
+            </w:r>
+          </w:p>
+        </w:tc>
+      </w:tr>
+      <w:tr>
+        <w:tc>
+          <w:tcPr>
+            <w:tcW w:type="dxa" w:w="2016"/>
+            <w:shd w:val="clear" w:fill="EAEEF3"/>
+          </w:tcPr>
+          <w:p>
+            <w:r>
+              <w:rPr>
+                <w:b/>
+              </w:rPr>
+              <w:t>Size</w:t>
+            </w:r>
+          </w:p>
+        </w:tc>
+        <w:tc>
+          <w:tcPr>
+            <w:tcW w:type="dxa" w:w="6912"/>
+          </w:tcPr>
+          <w:p>
+            <w:r>
+              <w:t>L (~2 days)</w:t>
+            </w:r>
+          </w:p>
+        </w:tc>
+      </w:tr>
+      <w:tr>
+        <w:tc>
+          <w:tcPr>
+            <w:tcW w:type="dxa" w:w="2016"/>
+            <w:shd w:val="clear" w:fill="EAEEF3"/>
+          </w:tcPr>
+          <w:p>
+            <w:r>
+              <w:rPr>
+                <w:b/>
+              </w:rPr>
+              <w:t>Depends on</w:t>
+            </w:r>
+          </w:p>
+        </w:tc>
+        <w:tc>
+          <w:tcPr>
+            <w:tcW w:type="dxa" w:w="6912"/>
+          </w:tcPr>
+          <w:p>
+            <w:r>
+              <w:t>F-11</w:t>
+            </w:r>
+          </w:p>
+        </w:tc>
+      </w:tr>
+      <w:tr>
+        <w:tc>
+          <w:tcPr>
+            <w:tcW w:type="dxa" w:w="2016"/>
+            <w:shd w:val="clear" w:fill="EAEEF3"/>
+          </w:tcPr>
+          <w:p>
+            <w:r>
+              <w:rPr>
+                <w:b/>
+              </w:rPr>
+              <w:t>AI-junior?</w:t>
+            </w:r>
+          </w:p>
+        </w:tc>
+        <w:tc>
+          <w:tcPr>
+            <w:tcW w:type="dxa" w:w="6912"/>
+          </w:tcPr>
+          <w:p>
+            <w:r>
+              <w:t>NO (core UX)</w:t>
+            </w:r>
+          </w:p>
+        </w:tc>
+      </w:tr>
+      <w:tr>
+        <w:tc>
+          <w:tcPr>
+            <w:tcW w:type="dxa" w:w="2016"/>
+            <w:shd w:val="clear" w:fill="EAEEF3"/>
+          </w:tcPr>
+          <w:p>
+            <w:r>
+              <w:rPr>
+                <w:b/>
+              </w:rPr>
+              <w:t>Spec refs</w:t>
+            </w:r>
+          </w:p>
+        </w:tc>
+        <w:tc>
+          <w:tcPr>
+            <w:tcW w:type="dxa" w:w="6912"/>
+          </w:tcPr>
+          <w:p>
+            <w:r>
+              <w:t>spec §8b</w:t>
+            </w:r>
+          </w:p>
+        </w:tc>
+      </w:tr>
+    </w:tbl>
+    <w:p/>
+    <w:p>
+      <w:r>
+        <w:rPr>
+          <w:b/>
+        </w:rPr>
+        <w:t xml:space="preserve">Description. </w:t>
+      </w:r>
+      <w:r>
+        <w:t>Edit one step inline.</w:t>
+      </w:r>
+    </w:p>
+    <w:p>
+      <w:pPr>
+        <w:pStyle w:val="IntenseQuote"/>
+      </w:pPr>
+      <w:r>
+        <w:t>Technical notes</w:t>
+      </w:r>
+    </w:p>
+    <w:p>
+      <w:pPr>
+        <w:pStyle w:val="ListBullet"/>
+      </w:pPr>
+      <w:r>
+        <w:t>Name, message (char count), single-start toggle, option rows (20/20 + target), delete.</w:t>
+      </w:r>
+    </w:p>
+    <w:p>
+      <w:pPr>
+        <w:pStyle w:val="IntenseQuote"/>
+      </w:pPr>
+      <w:r>
+        <w:t>Acceptance criteria</w:t>
+      </w:r>
+    </w:p>
+    <w:p>
+      <w:pPr>
+        <w:pStyle w:val="ListBullet"/>
+      </w:pPr>
+      <w:r>
+        <w:t>☐  Editing a step updates the collapsed card live.</w:t>
+      </w:r>
+    </w:p>
+    <w:p/>
+    <w:p>
+      <w:pPr>
+        <w:pStyle w:val="Heading3"/>
+      </w:pPr>
+      <w:r>
+        <w:rPr>
+          <w:color w:val="1F3A5F"/>
+        </w:rPr>
+        <w:t>F-13 · Live validation + activation</w:t>
+      </w:r>
+    </w:p>
+    <w:tbl>
+      <w:tblPr>
+        <w:tblStyle w:val="TableGrid"/>
+        <w:tblW w:type="auto" w:w="0"/>
+        <w:jc w:val="left"/>
+        <w:tblLook w:firstColumn="1" w:firstRow="1" w:lastColumn="0" w:lastRow="0" w:noHBand="0" w:noVBand="1" w:val="04A0"/>
+      </w:tblPr>
+      <w:tblGrid>
+        <w:gridCol w:w="4320"/>
+        <w:gridCol w:w="4320"/>
+      </w:tblGrid>
+      <w:tr>
+        <w:tc>
+          <w:tcPr>
+            <w:tcW w:type="dxa" w:w="2016"/>
+            <w:shd w:val="clear" w:fill="EAEEF3"/>
+          </w:tcPr>
+          <w:p>
+            <w:r>
+              <w:rPr>
+                <w:b/>
+              </w:rPr>
+              <w:t>Tag</w:t>
+            </w:r>
+          </w:p>
+        </w:tc>
+        <w:tc>
+          <w:tcPr>
+            <w:tcW w:type="dxa" w:w="6912"/>
+          </w:tcPr>
+          <w:p>
+            <w:r>
+              <w:t>[D] Dependent</w:t>
+            </w:r>
+          </w:p>
+        </w:tc>
+      </w:tr>
+      <w:tr>
+        <w:tc>
+          <w:tcPr>
+            <w:tcW w:type="dxa" w:w="2016"/>
+            <w:shd w:val="clear" w:fill="EAEEF3"/>
+          </w:tcPr>
+          <w:p>
+            <w:r>
+              <w:rPr>
+                <w:b/>
+              </w:rPr>
+              <w:t>Size</w:t>
+            </w:r>
+          </w:p>
+        </w:tc>
+        <w:tc>
+          <w:tcPr>
+            <w:tcW w:type="dxa" w:w="6912"/>
+          </w:tcPr>
+          <w:p>
+            <w:r>
+              <w:t>L (~2 days)</w:t>
+            </w:r>
+          </w:p>
+        </w:tc>
+      </w:tr>
+      <w:tr>
+        <w:tc>
+          <w:tcPr>
+            <w:tcW w:type="dxa" w:w="2016"/>
+            <w:shd w:val="clear" w:fill="EAEEF3"/>
+          </w:tcPr>
+          <w:p>
+            <w:r>
+              <w:rPr>
+                <w:b/>
+              </w:rPr>
+              <w:t>Depends on</w:t>
+            </w:r>
+          </w:p>
+        </w:tc>
+        <w:tc>
+          <w:tcPr>
+            <w:tcW w:type="dxa" w:w="6912"/>
+          </w:tcPr>
+          <w:p>
+            <w:r>
+              <w:t>F-12</w:t>
+            </w:r>
+          </w:p>
+        </w:tc>
+      </w:tr>
+      <w:tr>
+        <w:tc>
+          <w:tcPr>
+            <w:tcW w:type="dxa" w:w="2016"/>
+            <w:shd w:val="clear" w:fill="EAEEF3"/>
+          </w:tcPr>
+          <w:p>
+            <w:r>
+              <w:rPr>
+                <w:b/>
+              </w:rPr>
+              <w:t>AI-junior?</w:t>
+            </w:r>
+          </w:p>
+        </w:tc>
+        <w:tc>
+          <w:tcPr>
+            <w:tcW w:type="dxa" w:w="6912"/>
+          </w:tcPr>
+          <w:p>
+            <w:r>
+              <w:t>NO (correctness)</w:t>
+            </w:r>
+          </w:p>
+        </w:tc>
+      </w:tr>
+      <w:tr>
+        <w:tc>
+          <w:tcPr>
+            <w:tcW w:type="dxa" w:w="2016"/>
+            <w:shd w:val="clear" w:fill="EAEEF3"/>
+          </w:tcPr>
+          <w:p>
+            <w:r>
+              <w:rPr>
+                <w:b/>
+              </w:rPr>
+              <w:t>Spec refs</w:t>
+            </w:r>
+          </w:p>
+        </w:tc>
+        <w:tc>
+          <w:tcPr>
+            <w:tcW w:type="dxa" w:w="6912"/>
+          </w:tcPr>
+          <w:p>
+            <w:r>
+              <w:t>spec §8d</w:t>
+            </w:r>
+          </w:p>
+        </w:tc>
+      </w:tr>
+    </w:tbl>
+    <w:p/>
+    <w:p>
+      <w:r>
+        <w:rPr>
+          <w:b/>
+        </w:rPr>
+        <w:t xml:space="preserve">Description. </w:t>
+      </w:r>
+      <w:r>
+        <w:t>Client-side mirror of the validation gate.</w:t>
+      </w:r>
+    </w:p>
+    <w:p>
+      <w:pPr>
+        <w:pStyle w:val="IntenseQuote"/>
+      </w:pPr>
+      <w:r>
+        <w:t>Technical notes</w:t>
+      </w:r>
+    </w:p>
+    <w:p>
+      <w:pPr>
+        <w:pStyle w:val="ListBullet"/>
+      </w:pPr>
+      <w:r>
+        <w:t>V-01..V-06 on every change; banner; Activate disabled when invalid.</w:t>
+      </w:r>
+    </w:p>
+    <w:p>
+      <w:pPr>
+        <w:pStyle w:val="IntenseQuote"/>
+      </w:pPr>
+      <w:r>
+        <w:t>Acceptance criteria</w:t>
+      </w:r>
+    </w:p>
+    <w:p>
+      <w:pPr>
+        <w:pStyle w:val="ListBullet"/>
+      </w:pPr>
+      <w:r>
+        <w:t>☐  Invalid flow can't activate; errors clear when fixed. Server is source of truth.</w:t>
+      </w:r>
+    </w:p>
+    <w:p/>
+    <w:p>
+      <w:pPr>
+        <w:pStyle w:val="Heading2"/>
+      </w:pPr>
+      <w:r>
+        <w:rPr>
+          <w:color w:val="555555"/>
+        </w:rPr>
+        <w:t>Epic FE-E — Conversations</w:t>
+      </w:r>
+    </w:p>
+    <w:p>
+      <w:pPr>
+        <w:pStyle w:val="Heading3"/>
+      </w:pPr>
+      <w:r>
+        <w:rPr>
+          <w:color w:val="1F3A5F"/>
+        </w:rPr>
+        <w:t>F-14 · Conversation list</w:t>
+      </w:r>
+    </w:p>
+    <w:tbl>
+      <w:tblPr>
+        <w:tblStyle w:val="TableGrid"/>
+        <w:tblW w:type="auto" w:w="0"/>
+        <w:jc w:val="left"/>
+        <w:tblLook w:firstColumn="1" w:firstRow="1" w:lastColumn="0" w:lastRow="0" w:noHBand="0" w:noVBand="1" w:val="04A0"/>
+      </w:tblPr>
+      <w:tblGrid>
+        <w:gridCol w:w="4320"/>
+        <w:gridCol w:w="4320"/>
+      </w:tblGrid>
+      <w:tr>
+        <w:tc>
+          <w:tcPr>
+            <w:tcW w:type="dxa" w:w="2016"/>
+            <w:shd w:val="clear" w:fill="EAEEF3"/>
+          </w:tcPr>
+          <w:p>
+            <w:r>
+              <w:rPr>
+                <w:b/>
+              </w:rPr>
+              <w:t>Tag</w:t>
+            </w:r>
+          </w:p>
+        </w:tc>
+        <w:tc>
+          <w:tcPr>
+            <w:tcW w:type="dxa" w:w="6912"/>
+          </w:tcPr>
+          <w:p>
+            <w:r>
+              <w:t>[P] Parallel</w:t>
+            </w:r>
+          </w:p>
+        </w:tc>
+      </w:tr>
+      <w:tr>
+        <w:tc>
+          <w:tcPr>
+            <w:tcW w:type="dxa" w:w="2016"/>
+            <w:shd w:val="clear" w:fill="EAEEF3"/>
+          </w:tcPr>
+          <w:p>
+            <w:r>
+              <w:rPr>
+                <w:b/>
+              </w:rPr>
+              <w:t>Size</w:t>
+            </w:r>
+          </w:p>
+        </w:tc>
+        <w:tc>
+          <w:tcPr>
+            <w:tcW w:type="dxa" w:w="6912"/>
+          </w:tcPr>
+          <w:p>
+            <w:r>
+              <w:t>M (~1 day)</w:t>
+            </w:r>
+          </w:p>
+        </w:tc>
+      </w:tr>
+      <w:tr>
+        <w:tc>
+          <w:tcPr>
+            <w:tcW w:type="dxa" w:w="2016"/>
+            <w:shd w:val="clear" w:fill="EAEEF3"/>
+          </w:tcPr>
+          <w:p>
+            <w:r>
+              <w:rPr>
+                <w:b/>
+              </w:rPr>
+              <w:t>Depends on</w:t>
+            </w:r>
+          </w:p>
+        </w:tc>
+        <w:tc>
+          <w:tcPr>
+            <w:tcW w:type="dxa" w:w="6912"/>
+          </w:tcPr>
+          <w:p>
+            <w:r>
+              <w:t>F-09</w:t>
+            </w:r>
+          </w:p>
+        </w:tc>
+      </w:tr>
+      <w:tr>
+        <w:tc>
+          <w:tcPr>
+            <w:tcW w:type="dxa" w:w="2016"/>
+            <w:shd w:val="clear" w:fill="EAEEF3"/>
+          </w:tcPr>
+          <w:p>
+            <w:r>
+              <w:rPr>
+                <w:b/>
+              </w:rPr>
+              <w:t>AI-junior?</w:t>
+            </w:r>
+          </w:p>
+        </w:tc>
+        <w:tc>
+          <w:tcPr>
+            <w:tcW w:type="dxa" w:w="6912"/>
+          </w:tcPr>
+          <w:p>
+            <w:r>
+              <w:t>Yes</w:t>
+            </w:r>
+          </w:p>
+        </w:tc>
+      </w:tr>
+      <w:tr>
+        <w:tc>
+          <w:tcPr>
+            <w:tcW w:type="dxa" w:w="2016"/>
+            <w:shd w:val="clear" w:fill="EAEEF3"/>
+          </w:tcPr>
+          <w:p>
+            <w:r>
+              <w:rPr>
+                <w:b/>
+              </w:rPr>
+              <w:t>Spec refs</w:t>
+            </w:r>
+          </w:p>
+        </w:tc>
+        <w:tc>
+          <w:tcPr>
+            <w:tcW w:type="dxa" w:w="6912"/>
+          </w:tcPr>
+          <w:p>
+            <w:r>
+              <w:t>FR-18</w:t>
+            </w:r>
+          </w:p>
+        </w:tc>
+      </w:tr>
+    </w:tbl>
+    <w:p/>
+    <w:p>
+      <w:r>
+        <w:rPr>
+          <w:b/>
+        </w:rPr>
+        <w:t xml:space="preserve">Description. </w:t>
+      </w:r>
+      <w:r>
+        <w:t>Read-only session log.</w:t>
+      </w:r>
+    </w:p>
+    <w:p>
+      <w:pPr>
+        <w:pStyle w:val="IntenseQuote"/>
+      </w:pPr>
+      <w:r>
+        <w:t>Technical notes</w:t>
+      </w:r>
+    </w:p>
+    <w:p>
+      <w:pPr>
+        <w:pStyle w:val="ListBullet"/>
+      </w:pPr>
+      <w:r>
+        <w:t>Session rows: channel badge, customer id, path trail, timestamp, status; newest first.</w:t>
+      </w:r>
+    </w:p>
+    <w:p>
+      <w:pPr>
+        <w:pStyle w:val="IntenseQuote"/>
+      </w:pPr>
+      <w:r>
+        <w:t>Acceptance criteria</w:t>
+      </w:r>
+    </w:p>
+    <w:p>
+      <w:pPr>
+        <w:pStyle w:val="ListBullet"/>
+      </w:pPr>
+      <w:r>
+        <w:t>☐  Sessions listed with correct status badges.</w:t>
+      </w:r>
+    </w:p>
+    <w:p/>
+    <w:p>
+      <w:pPr>
+        <w:pStyle w:val="Heading3"/>
+      </w:pPr>
+      <w:r>
+        <w:rPr>
+          <w:color w:val="1F3A5F"/>
+        </w:rPr>
+        <w:t>F-15 · Message thread expand</w:t>
+      </w:r>
+    </w:p>
+    <w:tbl>
+      <w:tblPr>
+        <w:tblStyle w:val="TableGrid"/>
+        <w:tblW w:type="auto" w:w="0"/>
+        <w:jc w:val="left"/>
+        <w:tblLook w:firstColumn="1" w:firstRow="1" w:lastColumn="0" w:lastRow="0" w:noHBand="0" w:noVBand="1" w:val="04A0"/>
+      </w:tblPr>
+      <w:tblGrid>
+        <w:gridCol w:w="4320"/>
+        <w:gridCol w:w="4320"/>
+      </w:tblGrid>
+      <w:tr>
+        <w:tc>
+          <w:tcPr>
+            <w:tcW w:type="dxa" w:w="2016"/>
+            <w:shd w:val="clear" w:fill="EAEEF3"/>
+          </w:tcPr>
+          <w:p>
+            <w:r>
+              <w:rPr>
+                <w:b/>
+              </w:rPr>
+              <w:t>Tag</w:t>
+            </w:r>
+          </w:p>
+        </w:tc>
+        <w:tc>
+          <w:tcPr>
+            <w:tcW w:type="dxa" w:w="6912"/>
+          </w:tcPr>
+          <w:p>
+            <w:r>
+              <w:t>[D] Dependent</w:t>
+            </w:r>
+          </w:p>
+        </w:tc>
+      </w:tr>
+      <w:tr>
+        <w:tc>
+          <w:tcPr>
+            <w:tcW w:type="dxa" w:w="2016"/>
+            <w:shd w:val="clear" w:fill="EAEEF3"/>
+          </w:tcPr>
+          <w:p>
+            <w:r>
+              <w:rPr>
+                <w:b/>
+              </w:rPr>
+              <w:t>Size</w:t>
+            </w:r>
+          </w:p>
+        </w:tc>
+        <w:tc>
+          <w:tcPr>
+            <w:tcW w:type="dxa" w:w="6912"/>
+          </w:tcPr>
+          <w:p>
+            <w:r>
+              <w:t>M (~1 day)</w:t>
+            </w:r>
+          </w:p>
+        </w:tc>
+      </w:tr>
+      <w:tr>
+        <w:tc>
+          <w:tcPr>
+            <w:tcW w:type="dxa" w:w="2016"/>
+            <w:shd w:val="clear" w:fill="EAEEF3"/>
+          </w:tcPr>
+          <w:p>
+            <w:r>
+              <w:rPr>
+                <w:b/>
+              </w:rPr>
+              <w:t>Depends on</w:t>
+            </w:r>
+          </w:p>
+        </w:tc>
+        <w:tc>
+          <w:tcPr>
+            <w:tcW w:type="dxa" w:w="6912"/>
+          </w:tcPr>
+          <w:p>
+            <w:r>
+              <w:t>F-14</w:t>
+            </w:r>
+          </w:p>
+        </w:tc>
+      </w:tr>
+      <w:tr>
+        <w:tc>
+          <w:tcPr>
+            <w:tcW w:type="dxa" w:w="2016"/>
+            <w:shd w:val="clear" w:fill="EAEEF3"/>
+          </w:tcPr>
+          <w:p>
+            <w:r>
+              <w:rPr>
+                <w:b/>
+              </w:rPr>
+              <w:t>AI-junior?</w:t>
+            </w:r>
+          </w:p>
+        </w:tc>
+        <w:tc>
+          <w:tcPr>
+            <w:tcW w:type="dxa" w:w="6912"/>
+          </w:tcPr>
+          <w:p>
+            <w:r>
+              <w:t>Yes</w:t>
+            </w:r>
+          </w:p>
+        </w:tc>
+      </w:tr>
+      <w:tr>
+        <w:tc>
+          <w:tcPr>
+            <w:tcW w:type="dxa" w:w="2016"/>
+            <w:shd w:val="clear" w:fill="EAEEF3"/>
+          </w:tcPr>
+          <w:p>
+            <w:r>
+              <w:rPr>
+                <w:b/>
+              </w:rPr>
+              <w:t>Spec refs</w:t>
+            </w:r>
+          </w:p>
+        </w:tc>
+        <w:tc>
+          <w:tcPr>
+            <w:tcW w:type="dxa" w:w="6912"/>
+          </w:tcPr>
+          <w:p>
+            <w:r>
+              <w:t>spec §9</w:t>
+            </w:r>
+          </w:p>
+        </w:tc>
+      </w:tr>
+    </w:tbl>
+    <w:p/>
+    <w:p>
+      <w:r>
+        <w:rPr>
+          <w:b/>
+        </w:rPr>
+        <w:t xml:space="preserve">Description. </w:t>
+      </w:r>
+      <w:r>
+        <w:t>Inline thread on row expand.</w:t>
+      </w:r>
+    </w:p>
+    <w:p>
+      <w:pPr>
+        <w:pStyle w:val="IntenseQuote"/>
+      </w:pPr>
+      <w:r>
+        <w:t>Technical notes</w:t>
+      </w:r>
+    </w:p>
+    <w:p>
+      <w:pPr>
+        <w:pStyle w:val="ListBullet"/>
+      </w:pPr>
+      <w:r>
+        <w:t>Bot left, customer right, system events centred; toggle open/closed.</w:t>
+      </w:r>
+    </w:p>
+    <w:p>
+      <w:pPr>
+        <w:pStyle w:val="IntenseQuote"/>
+      </w:pPr>
+      <w:r>
+        <w:t>Acceptance criteria</w:t>
+      </w:r>
+    </w:p>
+    <w:p>
+      <w:pPr>
+        <w:pStyle w:val="ListBullet"/>
+      </w:pPr>
+      <w:r>
+        <w:t>☐  Expanding a row shows its full message thread.</w:t>
+      </w:r>
+    </w:p>
+    <w:p/>
+    <w:p>
+      <w:pPr>
+        <w:pStyle w:val="Heading2"/>
+      </w:pPr>
+      <w:r>
+        <w:rPr>
+          <w:color w:val="555555"/>
+        </w:rPr>
+        <w:t>Epic FE-F — Integration &amp; polish</w:t>
+      </w:r>
+    </w:p>
+    <w:p>
+      <w:pPr>
+        <w:pStyle w:val="Heading3"/>
+      </w:pPr>
+      <w:r>
+        <w:rPr>
+          <w:color w:val="1F3A5F"/>
+        </w:rPr>
+        <w:t>F-16 · Global states</w:t>
+      </w:r>
+    </w:p>
+    <w:tbl>
+      <w:tblPr>
+        <w:tblStyle w:val="TableGrid"/>
+        <w:tblW w:type="auto" w:w="0"/>
+        <w:jc w:val="left"/>
+        <w:tblLook w:firstColumn="1" w:firstRow="1" w:lastColumn="0" w:lastRow="0" w:noHBand="0" w:noVBand="1" w:val="04A0"/>
+      </w:tblPr>
+      <w:tblGrid>
+        <w:gridCol w:w="4320"/>
+        <w:gridCol w:w="4320"/>
+      </w:tblGrid>
+      <w:tr>
+        <w:tc>
+          <w:tcPr>
+            <w:tcW w:type="dxa" w:w="2016"/>
+            <w:shd w:val="clear" w:fill="EAEEF3"/>
+          </w:tcPr>
+          <w:p>
+            <w:r>
+              <w:rPr>
+                <w:b/>
+              </w:rPr>
+              <w:t>Tag</w:t>
+            </w:r>
+          </w:p>
+        </w:tc>
+        <w:tc>
+          <w:tcPr>
+            <w:tcW w:type="dxa" w:w="6912"/>
+          </w:tcPr>
+          <w:p>
+            <w:r>
+              <w:t>[P] Parallel</w:t>
+            </w:r>
+          </w:p>
+        </w:tc>
+      </w:tr>
+      <w:tr>
+        <w:tc>
+          <w:tcPr>
+            <w:tcW w:type="dxa" w:w="2016"/>
+            <w:shd w:val="clear" w:fill="EAEEF3"/>
+          </w:tcPr>
+          <w:p>
+            <w:r>
+              <w:rPr>
+                <w:b/>
+              </w:rPr>
+              <w:t>Size</w:t>
+            </w:r>
+          </w:p>
+        </w:tc>
+        <w:tc>
+          <w:tcPr>
+            <w:tcW w:type="dxa" w:w="6912"/>
+          </w:tcPr>
+          <w:p>
+            <w:r>
+              <w:t>M (~1 day)</w:t>
+            </w:r>
+          </w:p>
+        </w:tc>
+      </w:tr>
+      <w:tr>
+        <w:tc>
+          <w:tcPr>
+            <w:tcW w:type="dxa" w:w="2016"/>
+            <w:shd w:val="clear" w:fill="EAEEF3"/>
+          </w:tcPr>
+          <w:p>
+            <w:r>
+              <w:rPr>
+                <w:b/>
+              </w:rPr>
+              <w:t>Depends on</w:t>
+            </w:r>
+          </w:p>
+        </w:tc>
+        <w:tc>
+          <w:tcPr>
+            <w:tcW w:type="dxa" w:w="6912"/>
+          </w:tcPr>
+          <w:p>
+            <w:r>
+              <w:t>F-04</w:t>
+            </w:r>
+          </w:p>
+        </w:tc>
+      </w:tr>
+      <w:tr>
+        <w:tc>
+          <w:tcPr>
+            <w:tcW w:type="dxa" w:w="2016"/>
+            <w:shd w:val="clear" w:fill="EAEEF3"/>
+          </w:tcPr>
+          <w:p>
+            <w:r>
+              <w:rPr>
+                <w:b/>
+              </w:rPr>
+              <w:t>AI-junior?</w:t>
+            </w:r>
+          </w:p>
+        </w:tc>
+        <w:tc>
+          <w:tcPr>
+            <w:tcW w:type="dxa" w:w="6912"/>
+          </w:tcPr>
+          <w:p>
+            <w:r>
+              <w:t>Yes</w:t>
+            </w:r>
+          </w:p>
+        </w:tc>
+      </w:tr>
+      <w:tr>
+        <w:tc>
+          <w:tcPr>
+            <w:tcW w:type="dxa" w:w="2016"/>
+            <w:shd w:val="clear" w:fill="EAEEF3"/>
+          </w:tcPr>
+          <w:p>
+            <w:r>
+              <w:rPr>
+                <w:b/>
+              </w:rPr>
+              <w:t>Spec refs</w:t>
+            </w:r>
+          </w:p>
+        </w:tc>
+        <w:tc>
+          <w:tcPr>
+            <w:tcW w:type="dxa" w:w="6912"/>
+          </w:tcPr>
+          <w:p>
+            <w:r>
+              <w:t>spec §10</w:t>
+            </w:r>
+          </w:p>
+        </w:tc>
+      </w:tr>
+    </w:tbl>
+    <w:p/>
+    <w:p>
+      <w:r>
+        <w:rPr>
+          <w:b/>
+        </w:rPr>
+        <w:t xml:space="preserve">Description. </w:t>
+      </w:r>
+      <w:r>
+        <w:t>Consistent feedback patterns.</w:t>
+      </w:r>
+    </w:p>
+    <w:p>
+      <w:pPr>
+        <w:pStyle w:val="IntenseQuote"/>
+      </w:pPr>
+      <w:r>
+        <w:t>Technical notes</w:t>
+      </w:r>
+    </w:p>
+    <w:p>
+      <w:pPr>
+        <w:pStyle w:val="ListBullet"/>
+      </w:pPr>
+      <w:r>
+        <w:t>Toasts, loading skeletons, empty states applied everywhere.</w:t>
+      </w:r>
+    </w:p>
+    <w:p>
+      <w:pPr>
+        <w:pStyle w:val="IntenseQuote"/>
+      </w:pPr>
+      <w:r>
+        <w:t>Acceptance criteria</w:t>
+      </w:r>
+    </w:p>
+    <w:p>
+      <w:pPr>
+        <w:pStyle w:val="ListBullet"/>
+      </w:pPr>
+      <w:r>
+        <w:t>☐  Every list/async action has proper state feedback.</w:t>
+      </w:r>
+    </w:p>
+    <w:p/>
+    <w:p>
+      <w:pPr>
+        <w:pStyle w:val="Heading3"/>
+      </w:pPr>
+      <w:r>
+        <w:rPr>
+          <w:color w:val="1F3A5F"/>
+        </w:rPr>
+        <w:t>F-17 · Wire all screens to live API</w:t>
+      </w:r>
+    </w:p>
+    <w:tbl>
+      <w:tblPr>
+        <w:tblStyle w:val="TableGrid"/>
+        <w:tblW w:type="auto" w:w="0"/>
+        <w:jc w:val="left"/>
+        <w:tblLook w:firstColumn="1" w:firstRow="1" w:lastColumn="0" w:lastRow="0" w:noHBand="0" w:noVBand="1" w:val="04A0"/>
+      </w:tblPr>
+      <w:tblGrid>
+        <w:gridCol w:w="4320"/>
+        <w:gridCol w:w="4320"/>
+      </w:tblGrid>
+      <w:tr>
+        <w:tc>
+          <w:tcPr>
+            <w:tcW w:type="dxa" w:w="2016"/>
+            <w:shd w:val="clear" w:fill="EAEEF3"/>
+          </w:tcPr>
+          <w:p>
+            <w:r>
+              <w:rPr>
+                <w:b/>
+              </w:rPr>
+              <w:t>Tag</w:t>
+            </w:r>
+          </w:p>
+        </w:tc>
+        <w:tc>
+          <w:tcPr>
+            <w:tcW w:type="dxa" w:w="6912"/>
+          </w:tcPr>
+          <w:p>
+            <w:r>
+              <w:t>[D] Dependent</w:t>
+            </w:r>
+          </w:p>
+        </w:tc>
+      </w:tr>
+      <w:tr>
+        <w:tc>
+          <w:tcPr>
+            <w:tcW w:type="dxa" w:w="2016"/>
+            <w:shd w:val="clear" w:fill="EAEEF3"/>
+          </w:tcPr>
+          <w:p>
+            <w:r>
+              <w:rPr>
+                <w:b/>
+              </w:rPr>
+              <w:t>Size</w:t>
+            </w:r>
+          </w:p>
+        </w:tc>
+        <w:tc>
+          <w:tcPr>
+            <w:tcW w:type="dxa" w:w="6912"/>
+          </w:tcPr>
+          <w:p>
+            <w:r>
+              <w:t>L (~2 days)</w:t>
+            </w:r>
+          </w:p>
+        </w:tc>
+      </w:tr>
+      <w:tr>
+        <w:tc>
+          <w:tcPr>
+            <w:tcW w:type="dxa" w:w="2016"/>
+            <w:shd w:val="clear" w:fill="EAEEF3"/>
+          </w:tcPr>
+          <w:p>
+            <w:r>
+              <w:rPr>
+                <w:b/>
+              </w:rPr>
+              <w:t>Depends on</w:t>
+            </w:r>
+          </w:p>
+        </w:tc>
+        <w:tc>
+          <w:tcPr>
+            <w:tcW w:type="dxa" w:w="6912"/>
+          </w:tcPr>
+          <w:p>
+            <w:r>
+              <w:t>F-05..F-16</w:t>
+            </w:r>
+          </w:p>
+        </w:tc>
+      </w:tr>
+      <w:tr>
+        <w:tc>
+          <w:tcPr>
+            <w:tcW w:type="dxa" w:w="2016"/>
+            <w:shd w:val="clear" w:fill="EAEEF3"/>
+          </w:tcPr>
+          <w:p>
+            <w:r>
+              <w:rPr>
+                <w:b/>
+              </w:rPr>
+              <w:t>AI-junior?</w:t>
+            </w:r>
+          </w:p>
+        </w:tc>
+        <w:tc>
+          <w:tcPr>
+            <w:tcW w:type="dxa" w:w="6912"/>
+          </w:tcPr>
+          <w:p>
+            <w:r>
+              <w:t>Partial</w:t>
+            </w:r>
+          </w:p>
+        </w:tc>
+      </w:tr>
+      <w:tr>
+        <w:tc>
+          <w:tcPr>
+            <w:tcW w:type="dxa" w:w="2016"/>
+            <w:shd w:val="clear" w:fill="EAEEF3"/>
+          </w:tcPr>
+          <w:p>
+            <w:r>
+              <w:rPr>
+                <w:b/>
+              </w:rPr>
+              <w:t>Spec refs</w:t>
+            </w:r>
+          </w:p>
+        </w:tc>
+        <w:tc>
+          <w:tcPr>
+            <w:tcW w:type="dxa" w:w="6912"/>
+          </w:tcPr>
+          <w:p>
+            <w:r>
+              <w:t>spec §12</w:t>
+            </w:r>
+          </w:p>
+        </w:tc>
+      </w:tr>
+    </w:tbl>
+    <w:p/>
+    <w:p>
+      <w:r>
+        <w:rPr>
+          <w:b/>
+        </w:rPr>
+        <w:t xml:space="preserve">Description. </w:t>
+      </w:r>
+      <w:r>
+        <w:t>Replace mock data with real endpoints.</w:t>
+      </w:r>
+    </w:p>
+    <w:p>
+      <w:pPr>
+        <w:pStyle w:val="IntenseQuote"/>
+      </w:pPr>
+      <w:r>
+        <w:t>Technical notes</w:t>
+      </w:r>
+    </w:p>
+    <w:p>
+      <w:pPr>
+        <w:pStyle w:val="ListBullet"/>
+      </w:pPr>
+      <w:r>
+        <w:t>Every screen reads/writes real API; error + loading handled.</w:t>
+      </w:r>
+    </w:p>
+    <w:p>
+      <w:pPr>
+        <w:pStyle w:val="IntenseQuote"/>
+      </w:pPr>
+      <w:r>
+        <w:t>Acceptance criteria</w:t>
+      </w:r>
+    </w:p>
+    <w:p>
+      <w:pPr>
+        <w:pStyle w:val="ListBullet"/>
+      </w:pPr>
+      <w:r>
+        <w:t>☐  No mock data remains; full flow works end-to-end.</w:t>
+      </w:r>
+    </w:p>
+    <w:p/>
+    <w:p>
+      <w:pPr>
+        <w:pStyle w:val="Heading3"/>
+      </w:pPr>
+      <w:r>
+        <w:rPr>
+          <w:color w:val="1F3A5F"/>
+        </w:rPr>
+        <w:t>F-P1 · Live phone preview / simulator (Phase 2)</w:t>
+      </w:r>
+    </w:p>
+    <w:tbl>
+      <w:tblPr>
+        <w:tblStyle w:val="TableGrid"/>
+        <w:tblW w:type="auto" w:w="0"/>
+        <w:jc w:val="left"/>
+        <w:tblLook w:firstColumn="1" w:firstRow="1" w:lastColumn="0" w:lastRow="0" w:noHBand="0" w:noVBand="1" w:val="04A0"/>
+      </w:tblPr>
+      <w:tblGrid>
+        <w:gridCol w:w="4320"/>
+        <w:gridCol w:w="4320"/>
+      </w:tblGrid>
+      <w:tr>
+        <w:tc>
+          <w:tcPr>
+            <w:tcW w:type="dxa" w:w="2016"/>
+            <w:shd w:val="clear" w:fill="EAEEF3"/>
+          </w:tcPr>
+          <w:p>
+            <w:r>
+              <w:rPr>
+                <w:b/>
+              </w:rPr>
+              <w:t>Tag</w:t>
+            </w:r>
+          </w:p>
+        </w:tc>
+        <w:tc>
+          <w:tcPr>
+            <w:tcW w:type="dxa" w:w="6912"/>
+          </w:tcPr>
+          <w:p>
+            <w:r>
+              <w:t>[D] Dependent</w:t>
+            </w:r>
+          </w:p>
+        </w:tc>
+      </w:tr>
+      <w:tr>
+        <w:tc>
+          <w:tcPr>
+            <w:tcW w:type="dxa" w:w="2016"/>
+            <w:shd w:val="clear" w:fill="EAEEF3"/>
+          </w:tcPr>
+          <w:p>
+            <w:r>
+              <w:rPr>
+                <w:b/>
+              </w:rPr>
+              <w:t>Size</w:t>
+            </w:r>
+          </w:p>
+        </w:tc>
+        <w:tc>
+          <w:tcPr>
+            <w:tcW w:type="dxa" w:w="6912"/>
+          </w:tcPr>
+          <w:p>
+            <w:r>
+              <w:t>L (~2 days)</w:t>
+            </w:r>
+          </w:p>
+        </w:tc>
+      </w:tr>
+      <w:tr>
+        <w:tc>
+          <w:tcPr>
+            <w:tcW w:type="dxa" w:w="2016"/>
+            <w:shd w:val="clear" w:fill="EAEEF3"/>
+          </w:tcPr>
+          <w:p>
+            <w:r>
+              <w:rPr>
+                <w:b/>
+              </w:rPr>
+              <w:t>Depends on</w:t>
+            </w:r>
+          </w:p>
+        </w:tc>
+        <w:tc>
+          <w:tcPr>
+            <w:tcW w:type="dxa" w:w="6912"/>
+          </w:tcPr>
+          <w:p>
+            <w:r>
+              <w:t>F-13</w:t>
+            </w:r>
+          </w:p>
+        </w:tc>
+      </w:tr>
+      <w:tr>
+        <w:tc>
+          <w:tcPr>
+            <w:tcW w:type="dxa" w:w="2016"/>
+            <w:shd w:val="clear" w:fill="EAEEF3"/>
+          </w:tcPr>
+          <w:p>
+            <w:r>
+              <w:rPr>
+                <w:b/>
+              </w:rPr>
+              <w:t>AI-junior?</w:t>
+            </w:r>
+          </w:p>
+        </w:tc>
+        <w:tc>
+          <w:tcPr>
+            <w:tcW w:type="dxa" w:w="6912"/>
+          </w:tcPr>
+          <w:p>
+            <w:r>
+              <w:t>NO</w:t>
+            </w:r>
+          </w:p>
+        </w:tc>
+      </w:tr>
+      <w:tr>
+        <w:tc>
+          <w:tcPr>
+            <w:tcW w:type="dxa" w:w="2016"/>
+            <w:shd w:val="clear" w:fill="EAEEF3"/>
+          </w:tcPr>
+          <w:p>
+            <w:r>
+              <w:rPr>
+                <w:b/>
+              </w:rPr>
+              <w:t>Spec refs</w:t>
+            </w:r>
+          </w:p>
+        </w:tc>
+        <w:tc>
+          <w:tcPr>
+            <w:tcW w:type="dxa" w:w="6912"/>
+          </w:tcPr>
+          <w:p>
+            <w:r>
+              <w:t>spec §11</w:t>
+            </w:r>
+          </w:p>
+        </w:tc>
+      </w:tr>
+    </w:tbl>
+    <w:p/>
+    <w:p>
+      <w:r>
+        <w:rPr>
+          <w:b/>
+        </w:rPr>
+        <w:t xml:space="preserve">Description. </w:t>
+      </w:r>
+      <w:r>
+        <w:t>Deferred: in-browser WhatsApp/IG simulator running the real flow.</w:t>
+      </w:r>
+    </w:p>
+    <w:p>
+      <w:pPr>
+        <w:pStyle w:val="IntenseQuote"/>
+      </w:pPr>
+      <w:r>
+        <w:t>Technical notes</w:t>
+      </w:r>
+    </w:p>
+    <w:p>
+      <w:pPr>
+        <w:pStyle w:val="ListBullet"/>
+      </w:pPr>
+      <w:r>
+        <w:t>Channel toggle + reset; branch/re-prompt/handoff. NOT in v1.</w:t>
+      </w:r>
+    </w:p>
+    <w:p>
+      <w:pPr>
+        <w:pStyle w:val="IntenseQuote"/>
+      </w:pPr>
+      <w:r>
+        <w:t>Acceptance criteria</w:t>
+      </w:r>
+    </w:p>
+    <w:p>
+      <w:pPr>
+        <w:pStyle w:val="ListBullet"/>
+      </w:pPr>
+      <w:r>
+        <w:t>☐  Phase 2 — simulator runs a client's real flow in-browser.</w:t>
       </w:r>
     </w:p>
     <w:p/>

</xml_diff>